<commit_message>
refactor: update cse lab4
</commit_message>
<xml_diff>
--- a/2_course/cse/lab4/ОПИ_Ларионов_ВВ_P3209_ЛР4.docx
+++ b/2_course/cse/lab4/ОПИ_Ларионов_ВВ_P3209_ЛР4.docx
@@ -484,7 +484,7 @@
             </w:rPr>
             <w:fldChar w:fldCharType="separate"/>
           </w:r>
-          <w:hyperlink w:anchor="_Toc229509435" w:history="1">
+          <w:hyperlink w:anchor="_Toc229595932" w:history="1">
             <w:r>
               <w:rPr>
                 <w:rStyle w:val="af2"/>
@@ -515,7 +515,7 @@
                 <w:noProof/>
                 <w:webHidden/>
               </w:rPr>
-              <w:instrText xml:space="preserve"> PAGEREF _Toc229509435 \h </w:instrText>
+              <w:instrText xml:space="preserve"> PAGEREF _Toc229595932 \h </w:instrText>
             </w:r>
             <w:r>
               <w:rPr>
@@ -558,7 +558,7 @@
               <w:lang w:eastAsia="ru-RU"/>
             </w:rPr>
           </w:pPr>
-          <w:hyperlink w:anchor="_Toc229509436" w:history="1">
+          <w:hyperlink w:anchor="_Toc229595933" w:history="1">
             <w:r>
               <w:rPr>
                 <w:rStyle w:val="af2"/>
@@ -589,7 +589,7 @@
                 <w:noProof/>
                 <w:webHidden/>
               </w:rPr>
-              <w:instrText xml:space="preserve"> PAGEREF _Toc229509436 \h </w:instrText>
+              <w:instrText xml:space="preserve"> PAGEREF _Toc229595933 \h </w:instrText>
             </w:r>
             <w:r>
               <w:rPr>
@@ -632,7 +632,7 @@
               <w:lang w:eastAsia="ru-RU"/>
             </w:rPr>
           </w:pPr>
-          <w:hyperlink w:anchor="_Toc229509437" w:history="1">
+          <w:hyperlink w:anchor="_Toc229595934" w:history="1">
             <w:r>
               <w:rPr>
                 <w:rStyle w:val="af2"/>
@@ -663,7 +663,7 @@
                 <w:noProof/>
                 <w:webHidden/>
               </w:rPr>
-              <w:instrText xml:space="preserve"> PAGEREF _Toc229509437 \h </w:instrText>
+              <w:instrText xml:space="preserve"> PAGEREF _Toc229595934 \h </w:instrText>
             </w:r>
             <w:r>
               <w:rPr>
@@ -706,7 +706,7 @@
               <w:lang w:eastAsia="ru-RU"/>
             </w:rPr>
           </w:pPr>
-          <w:hyperlink w:anchor="_Toc229509438" w:history="1">
+          <w:hyperlink w:anchor="_Toc229595935" w:history="1">
             <w:r>
               <w:rPr>
                 <w:rStyle w:val="af2"/>
@@ -737,7 +737,7 @@
                 <w:noProof/>
                 <w:webHidden/>
               </w:rPr>
-              <w:instrText xml:space="preserve"> PAGEREF _Toc229509438 \h </w:instrText>
+              <w:instrText xml:space="preserve"> PAGEREF _Toc229595935 \h </w:instrText>
             </w:r>
             <w:r>
               <w:rPr>
@@ -780,7 +780,7 @@
               <w:lang w:eastAsia="ru-RU"/>
             </w:rPr>
           </w:pPr>
-          <w:hyperlink w:anchor="_Toc229509439" w:history="1">
+          <w:hyperlink w:anchor="_Toc229595936" w:history="1">
             <w:r>
               <w:rPr>
                 <w:rStyle w:val="af2"/>
@@ -811,7 +811,7 @@
                 <w:noProof/>
                 <w:webHidden/>
               </w:rPr>
-              <w:instrText xml:space="preserve"> PAGEREF _Toc229509439 \h </w:instrText>
+              <w:instrText xml:space="preserve"> PAGEREF _Toc229595936 \h </w:instrText>
             </w:r>
             <w:r>
               <w:rPr>
@@ -831,7 +831,7 @@
                 <w:noProof/>
                 <w:webHidden/>
               </w:rPr>
-              <w:t>14</w:t>
+              <w:t>15</w:t>
             </w:r>
             <w:r>
               <w:rPr>
@@ -854,7 +854,7 @@
               <w:lang w:eastAsia="ru-RU"/>
             </w:rPr>
           </w:pPr>
-          <w:hyperlink w:anchor="_Toc229509440" w:history="1">
+          <w:hyperlink w:anchor="_Toc229595937" w:history="1">
             <w:r>
               <w:rPr>
                 <w:rStyle w:val="af2"/>
@@ -885,7 +885,7 @@
                 <w:noProof/>
                 <w:webHidden/>
               </w:rPr>
-              <w:instrText xml:space="preserve"> PAGEREF _Toc229509440 \h </w:instrText>
+              <w:instrText xml:space="preserve"> PAGEREF _Toc229595937 \h </w:instrText>
             </w:r>
             <w:r>
               <w:rPr>
@@ -905,7 +905,7 @@
                 <w:noProof/>
                 <w:webHidden/>
               </w:rPr>
-              <w:t>14</w:t>
+              <w:t>15</w:t>
             </w:r>
             <w:r>
               <w:rPr>
@@ -1122,7 +1122,7 @@
           <w:lang w:eastAsia="ru-RU"/>
         </w:rPr>
       </w:pPr>
-      <w:bookmarkStart w:id="0" w:name="_Toc229509435"/>
+      <w:bookmarkStart w:id="0" w:name="_Toc229595932"/>
       <w:r>
         <w:rPr>
           <w:rFonts w:asciiTheme="minorHAnsi" w:hAnsiTheme="minorHAnsi" w:cs="Times New Roman"/>
@@ -1511,7 +1511,7 @@
           <w:lang w:eastAsia="ru-RU"/>
         </w:rPr>
       </w:pPr>
-      <w:bookmarkStart w:id="1" w:name="_Toc229509436"/>
+      <w:bookmarkStart w:id="1" w:name="_Toc229595933"/>
       <w:r>
         <w:rPr>
           <w:rFonts w:asciiTheme="minorHAnsi" w:hAnsiTheme="minorHAnsi" w:cs="Times New Roman"/>
@@ -2216,7 +2216,7 @@
           <w:lang w:eastAsia="ru-RU"/>
         </w:rPr>
       </w:pPr>
-      <w:bookmarkStart w:id="2" w:name="_Toc229509437"/>
+      <w:bookmarkStart w:id="2" w:name="_Toc229595934"/>
       <w:r>
         <w:rPr>
           <w:rFonts w:asciiTheme="minorHAnsi" w:hAnsiTheme="minorHAnsi" w:cs="Times New Roman"/>
@@ -2675,12 +2675,69 @@
           <w:color w:val="212529"/>
         </w:rPr>
       </w:pPr>
-      <w:r>
-        <w:rPr>
-          <w:rFonts w:cs="Segoe UI"/>
-          <w:color w:val="212529"/>
-        </w:rPr>
-        <w:t>По данным Memory Sampler VisualVM наибольший объем памяти среди всех классов занимают объекты класса byte[]: 29 761 008 B, 302 135 объектов.</w:t>
+    </w:p>
+    <w:p>
+      <w:pPr>
+        <w:shd w:val="clear" w:color="auto" w:fill="FFFFFF"/>
+        <w:spacing w:before="100" w:beforeAutospacing="1" w:after="100" w:afterAutospacing="1" w:line="240" w:lineRule="auto"/>
+        <w:rPr>
+          <w:rFonts w:cs="Segoe UI"/>
+          <w:color w:val="212529"/>
+        </w:rPr>
+      </w:pPr>
+    </w:p>
+    <w:p>
+      <w:pPr>
+        <w:shd w:val="clear" w:color="auto" w:fill="FFFFFF"/>
+        <w:spacing w:before="100" w:beforeAutospacing="1" w:after="100" w:afterAutospacing="1" w:line="240" w:lineRule="auto"/>
+        <w:rPr>
+          <w:rFonts w:cs="Segoe UI"/>
+          <w:color w:val="212529"/>
+        </w:rPr>
+      </w:pPr>
+    </w:p>
+    <w:p>
+      <w:pPr>
+        <w:shd w:val="clear" w:color="auto" w:fill="FFFFFF"/>
+        <w:spacing w:before="100" w:beforeAutospacing="1" w:after="100" w:afterAutospacing="1" w:line="240" w:lineRule="auto"/>
+        <w:rPr>
+          <w:rFonts w:cs="Segoe UI"/>
+          <w:color w:val="212529"/>
+        </w:rPr>
+      </w:pPr>
+    </w:p>
+    <w:p>
+      <w:pPr>
+        <w:shd w:val="clear" w:color="auto" w:fill="FFFFFF"/>
+        <w:spacing w:before="100" w:beforeAutospacing="1" w:after="100" w:afterAutospacing="1" w:line="240" w:lineRule="auto"/>
+        <w:rPr>
+          <w:rFonts w:cs="Segoe UI"/>
+          <w:color w:val="212529"/>
+        </w:rPr>
+      </w:pPr>
+      <w:r>
+        <w:rPr>
+          <w:rFonts w:cs="Segoe UI"/>
+          <w:color w:val="212529"/>
+        </w:rPr>
+        <w:lastRenderedPageBreak/>
+        <w:t xml:space="preserve">По данным Memory Sampler VisualVM наибольший объем памяти среди всех классов занимают объекты класса </w:t>
+      </w:r>
+      <w:proofErr w:type="gramStart"/>
+      <w:r>
+        <w:rPr>
+          <w:rFonts w:cs="Segoe UI"/>
+          <w:color w:val="212529"/>
+        </w:rPr>
+        <w:t>byte[</w:t>
+      </w:r>
+      <w:proofErr w:type="gramEnd"/>
+      <w:r>
+        <w:rPr>
+          <w:rFonts w:cs="Segoe UI"/>
+          <w:color w:val="212529"/>
+        </w:rPr>
+        <w:t>]: 29 761 008 B, 302 135 объектов.</w:t>
       </w:r>
     </w:p>
     <w:p>
@@ -2763,7 +2820,6 @@
           <w:rFonts w:cs="Segoe UI"/>
           <w:color w:val="212529"/>
         </w:rPr>
-        <w:lastRenderedPageBreak/>
         <w:t xml:space="preserve">Пользовательского класса </w:t>
       </w:r>
       <w:proofErr w:type="spellStart"/>
@@ -3002,36 +3058,7 @@
         <w:rPr>
           <w:rFonts w:cs="Segoe UI"/>
           <w:color w:val="212529"/>
-        </w:rPr>
-      </w:pPr>
-    </w:p>
-    <w:p>
-      <w:pPr>
-        <w:shd w:val="clear" w:color="auto" w:fill="FFFFFF"/>
-        <w:spacing w:before="100" w:beforeAutospacing="1" w:after="100" w:afterAutospacing="1" w:line="240" w:lineRule="auto"/>
-        <w:rPr>
-          <w:rFonts w:cs="Segoe UI"/>
-          <w:color w:val="212529"/>
-        </w:rPr>
-      </w:pPr>
-    </w:p>
-    <w:p>
-      <w:pPr>
-        <w:shd w:val="clear" w:color="auto" w:fill="FFFFFF"/>
-        <w:spacing w:before="100" w:beforeAutospacing="1" w:after="100" w:afterAutospacing="1" w:line="240" w:lineRule="auto"/>
-        <w:rPr>
-          <w:rFonts w:cs="Segoe UI"/>
-          <w:color w:val="212529"/>
-        </w:rPr>
-      </w:pPr>
-    </w:p>
-    <w:p>
-      <w:pPr>
-        <w:shd w:val="clear" w:color="auto" w:fill="FFFFFF"/>
-        <w:spacing w:before="100" w:beforeAutospacing="1" w:after="100" w:afterAutospacing="1" w:line="240" w:lineRule="auto"/>
-        <w:rPr>
-          <w:rFonts w:cs="Segoe UI"/>
-          <w:color w:val="212529"/>
+          <w:lang w:val="en-US"/>
         </w:rPr>
       </w:pPr>
     </w:p>
@@ -3046,7 +3073,7 @@
           <w:lang w:eastAsia="ru-RU"/>
         </w:rPr>
       </w:pPr>
-      <w:bookmarkStart w:id="3" w:name="_Toc229509438"/>
+      <w:bookmarkStart w:id="3" w:name="_Toc229595935"/>
       <w:r>
         <w:rPr>
           <w:rFonts w:asciiTheme="minorHAnsi" w:hAnsiTheme="minorHAnsi" w:cs="Times New Roman"/>
@@ -3085,20 +3112,19 @@
         <w:rPr>
           <w:rFonts w:cs="Segoe UI"/>
           <w:color w:val="212529"/>
-          <w:lang w:val="en-US"/>
-        </w:rPr>
-      </w:pPr>
-      <w:r>
-        <w:rPr>
-          <w:rFonts w:cs="Segoe UI"/>
-          <w:color w:val="212529"/>
-          <w:lang w:val="en-US"/>
+        </w:rPr>
+      </w:pPr>
+      <w:r>
+        <w:rPr>
+          <w:rFonts w:cs="Segoe UI"/>
+          <w:noProof/>
+          <w:color w:val="212529"/>
         </w:rPr>
         <w:drawing>
-          <wp:inline distT="0" distB="0" distL="0" distR="0" wp14:anchorId="6B565085" wp14:editId="0D41940F">
-            <wp:extent cx="5940425" cy="2924810"/>
-            <wp:effectExtent l="0" t="0" r="3175" b="0"/>
-            <wp:docPr id="1168672990" name="Рисунок 1"/>
+          <wp:inline distT="0" distB="0" distL="0" distR="0" wp14:anchorId="6D75C614" wp14:editId="120E99A3">
+            <wp:extent cx="5377218" cy="3891371"/>
+            <wp:effectExtent l="0" t="0" r="0" b="0"/>
+            <wp:docPr id="1111215401" name="Рисунок 1"/>
             <wp:cNvGraphicFramePr>
               <a:graphicFrameLocks xmlns:a="http://schemas.openxmlformats.org/drawingml/2006/main" noChangeAspect="1"/>
             </wp:cNvGraphicFramePr>
@@ -3106,7 +3132,7 @@
               <a:graphicData uri="http://schemas.openxmlformats.org/drawingml/2006/picture">
                 <pic:pic xmlns:pic="http://schemas.openxmlformats.org/drawingml/2006/picture">
                   <pic:nvPicPr>
-                    <pic:cNvPr id="1168672990" name=""/>
+                    <pic:cNvPr id="1111215401" name=""/>
                     <pic:cNvPicPr/>
                   </pic:nvPicPr>
                   <pic:blipFill>
@@ -3118,7 +3144,7 @@
                   <pic:spPr>
                     <a:xfrm>
                       <a:off x="0" y="0"/>
-                      <a:ext cx="5940425" cy="2924810"/>
+                      <a:ext cx="5397538" cy="3906076"/>
                     </a:xfrm>
                     <a:prstGeom prst="rect">
                       <a:avLst/>
@@ -3130,6 +3156,14 @@
           </wp:inline>
         </w:drawing>
       </w:r>
+      <w:r>
+        <w:rPr>
+          <w:rFonts w:cs="Segoe UI"/>
+          <w:noProof/>
+          <w:color w:val="212529"/>
+        </w:rPr>
+        <w:t xml:space="preserve"> </w:t>
+      </w:r>
     </w:p>
     <w:p>
       <w:pPr>
@@ -3139,7 +3173,6 @@
         <w:rPr>
           <w:rFonts w:cs="Segoe UI"/>
           <w:color w:val="212529"/>
-          <w:lang w:val="en-US"/>
         </w:rPr>
       </w:pPr>
       <w:r>
@@ -3153,7 +3186,6 @@
         <w:rPr>
           <w:rFonts w:cs="Segoe UI"/>
           <w:color w:val="212529"/>
-          <w:lang w:val="en-US"/>
         </w:rPr>
         <w:t>. 4.</w:t>
       </w:r>
@@ -3161,7 +3193,6 @@
         <w:rPr>
           <w:rFonts w:cs="Segoe UI"/>
           <w:color w:val="212529"/>
-          <w:lang w:val="en-US"/>
         </w:rPr>
         <w:t>1</w:t>
       </w:r>
@@ -3169,7 +3200,6 @@
         <w:rPr>
           <w:rFonts w:cs="Segoe UI"/>
           <w:color w:val="212529"/>
-          <w:lang w:val="en-US"/>
         </w:rPr>
         <w:t xml:space="preserve"> – </w:t>
       </w:r>
@@ -3177,71 +3207,8 @@
         <w:rPr>
           <w:rFonts w:cs="Segoe UI"/>
           <w:color w:val="212529"/>
-          <w:lang w:val="en-US"/>
-        </w:rPr>
-        <w:t>Call Tree</w:t>
-      </w:r>
-      <w:r>
-        <w:rPr>
-          <w:rFonts w:cs="Segoe UI"/>
-          <w:color w:val="212529"/>
-          <w:lang w:val="en-US"/>
-        </w:rPr>
-        <w:t xml:space="preserve"> </w:t>
-      </w:r>
-      <w:r>
-        <w:rPr>
-          <w:rFonts w:cs="Segoe UI"/>
-          <w:color w:val="212529"/>
-        </w:rPr>
-        <w:t>по</w:t>
-      </w:r>
-      <w:r>
-        <w:rPr>
-          <w:rFonts w:cs="Segoe UI"/>
-          <w:color w:val="212529"/>
-          <w:lang w:val="en-US"/>
-        </w:rPr>
-        <w:t xml:space="preserve"> </w:t>
-      </w:r>
-      <w:r>
-        <w:rPr>
-          <w:rFonts w:cs="Segoe UI"/>
-          <w:color w:val="212529"/>
-          <w:lang w:val="en-US"/>
-        </w:rPr>
-        <w:t>CPU Time</w:t>
-      </w:r>
-      <w:r>
-        <w:rPr>
-          <w:rFonts w:cs="Segoe UI"/>
-          <w:color w:val="212529"/>
-          <w:lang w:val="en-US"/>
-        </w:rPr>
-        <w:t xml:space="preserve"> </w:t>
-      </w:r>
-      <w:r>
-        <w:rPr>
-          <w:rFonts w:cs="Segoe UI"/>
-          <w:color w:val="212529"/>
-        </w:rPr>
-        <w:t>в</w:t>
-      </w:r>
-      <w:r>
-        <w:rPr>
-          <w:rFonts w:cs="Segoe UI"/>
-          <w:color w:val="212529"/>
-          <w:lang w:val="en-US"/>
-        </w:rPr>
-        <w:t xml:space="preserve"> </w:t>
-      </w:r>
-      <w:r>
-        <w:rPr>
-          <w:rFonts w:cs="Segoe UI"/>
-          <w:color w:val="212529"/>
-          <w:lang w:val="en-US"/>
-        </w:rPr>
-        <w:t>IntelliJ Idea</w:t>
+        </w:rPr>
+        <w:t>показатели до исправления</w:t>
       </w:r>
     </w:p>
     <w:p>
@@ -3252,20 +3219,18 @@
         <w:rPr>
           <w:rFonts w:cs="Segoe UI"/>
           <w:color w:val="212529"/>
-          <w:lang w:val="en-US"/>
-        </w:rPr>
-      </w:pPr>
-      <w:r>
-        <w:rPr>
-          <w:rFonts w:cs="Segoe UI"/>
-          <w:color w:val="212529"/>
-          <w:lang w:val="en-US"/>
+        </w:rPr>
+      </w:pPr>
+      <w:r>
+        <w:rPr>
+          <w:rFonts w:cs="Segoe UI"/>
+          <w:color w:val="212529"/>
         </w:rPr>
         <w:drawing>
-          <wp:inline distT="0" distB="0" distL="0" distR="0" wp14:anchorId="1BA50FA8" wp14:editId="36219E72">
-            <wp:extent cx="5940425" cy="2381250"/>
-            <wp:effectExtent l="0" t="0" r="3175" b="6350"/>
-            <wp:docPr id="468193868" name="Рисунок 1"/>
+          <wp:inline distT="0" distB="0" distL="0" distR="0" wp14:anchorId="05DFCB64" wp14:editId="3EEE79A3">
+            <wp:extent cx="5227093" cy="3565375"/>
+            <wp:effectExtent l="0" t="0" r="5715" b="3810"/>
+            <wp:docPr id="1385627846" name="Рисунок 1"/>
             <wp:cNvGraphicFramePr>
               <a:graphicFrameLocks xmlns:a="http://schemas.openxmlformats.org/drawingml/2006/main" noChangeAspect="1"/>
             </wp:cNvGraphicFramePr>
@@ -3273,7 +3238,7 @@
               <a:graphicData uri="http://schemas.openxmlformats.org/drawingml/2006/picture">
                 <pic:pic xmlns:pic="http://schemas.openxmlformats.org/drawingml/2006/picture">
                   <pic:nvPicPr>
-                    <pic:cNvPr id="468193868" name=""/>
+                    <pic:cNvPr id="1385627846" name=""/>
                     <pic:cNvPicPr/>
                   </pic:nvPicPr>
                   <pic:blipFill>
@@ -3285,7 +3250,7 @@
                   <pic:spPr>
                     <a:xfrm>
                       <a:off x="0" y="0"/>
-                      <a:ext cx="5940425" cy="2381250"/>
+                      <a:ext cx="5262989" cy="3589859"/>
                     </a:xfrm>
                     <a:prstGeom prst="rect">
                       <a:avLst/>
@@ -3306,15 +3271,43 @@
         <w:rPr>
           <w:rFonts w:cs="Segoe UI"/>
           <w:color w:val="212529"/>
+        </w:rPr>
+      </w:pPr>
+      <w:r>
+        <w:rPr>
+          <w:rFonts w:cs="Segoe UI"/>
+          <w:color w:val="212529"/>
+        </w:rPr>
+        <w:t>Рис. 4.</w:t>
+      </w:r>
+      <w:r>
+        <w:rPr>
+          <w:rFonts w:cs="Segoe UI"/>
+          <w:color w:val="212529"/>
+        </w:rPr>
+        <w:t>2</w:t>
+      </w:r>
+      <w:r>
+        <w:rPr>
+          <w:rFonts w:cs="Segoe UI"/>
+          <w:color w:val="212529"/>
+        </w:rPr>
+        <w:t xml:space="preserve"> – </w:t>
+      </w:r>
+      <w:r>
+        <w:rPr>
+          <w:rFonts w:cs="Segoe UI"/>
+          <w:color w:val="212529"/>
           <w:lang w:val="en-US"/>
         </w:rPr>
-      </w:pPr>
-      <w:r>
-        <w:rPr>
-          <w:rFonts w:cs="Segoe UI"/>
-          <w:color w:val="212529"/>
-        </w:rPr>
-        <w:t>Рис</w:t>
+        <w:t>Heap</w:t>
+      </w:r>
+      <w:r>
+        <w:rPr>
+          <w:rFonts w:cs="Segoe UI"/>
+          <w:color w:val="212529"/>
+        </w:rPr>
+        <w:t xml:space="preserve"> </w:t>
       </w:r>
       <w:r>
         <w:rPr>
@@ -3322,28 +3315,12 @@
           <w:color w:val="212529"/>
           <w:lang w:val="en-US"/>
         </w:rPr>
-        <w:t xml:space="preserve">. 4.2 – </w:t>
-      </w:r>
-      <w:r>
-        <w:rPr>
-          <w:rFonts w:cs="Segoe UI"/>
-          <w:color w:val="212529"/>
-          <w:lang w:val="en-US"/>
-        </w:rPr>
-        <w:t xml:space="preserve">Call Tree </w:t>
-      </w:r>
-      <w:r>
-        <w:rPr>
-          <w:rFonts w:cs="Segoe UI"/>
-          <w:color w:val="212529"/>
-        </w:rPr>
-        <w:t>по</w:t>
-      </w:r>
-      <w:r>
-        <w:rPr>
-          <w:rFonts w:cs="Segoe UI"/>
-          <w:color w:val="212529"/>
-          <w:lang w:val="en-US"/>
+        <w:t>Dump</w:t>
+      </w:r>
+      <w:r>
+        <w:rPr>
+          <w:rFonts w:cs="Segoe UI"/>
+          <w:color w:val="212529"/>
         </w:rPr>
         <w:t xml:space="preserve"> </w:t>
       </w:r>
@@ -3351,32 +3328,15 @@
         <w:rPr>
           <w:rFonts w:cs="Segoe UI"/>
           <w:color w:val="212529"/>
-          <w:lang w:val="en-US"/>
-        </w:rPr>
-        <w:t xml:space="preserve">Memory Allocations </w:t>
-      </w:r>
-      <w:r>
-        <w:rPr>
-          <w:rFonts w:cs="Segoe UI"/>
-          <w:color w:val="212529"/>
-        </w:rPr>
-        <w:t>в</w:t>
-      </w:r>
-      <w:r>
-        <w:rPr>
-          <w:rFonts w:cs="Segoe UI"/>
-          <w:color w:val="212529"/>
-          <w:lang w:val="en-US"/>
+        </w:rPr>
+        <w:t>до исправления</w:t>
+      </w:r>
+      <w:r>
+        <w:rPr>
+          <w:rFonts w:cs="Segoe UI"/>
+          <w:color w:val="212529"/>
         </w:rPr>
         <w:t xml:space="preserve"> </w:t>
-      </w:r>
-      <w:r>
-        <w:rPr>
-          <w:rFonts w:cs="Segoe UI"/>
-          <w:color w:val="212529"/>
-          <w:lang w:val="en-US"/>
-        </w:rPr>
-        <w:t>IntelliJ Idea</w:t>
       </w:r>
     </w:p>
     <w:p>
@@ -3396,10 +3356,10 @@
         </w:rPr>
         <w:lastRenderedPageBreak/>
         <w:drawing>
-          <wp:inline distT="0" distB="0" distL="0" distR="0" wp14:anchorId="7758B135" wp14:editId="4183B980">
-            <wp:extent cx="5940425" cy="3799204"/>
-            <wp:effectExtent l="0" t="0" r="3175" b="0"/>
-            <wp:docPr id="855013758" name="Рисунок 1"/>
+          <wp:inline distT="0" distB="0" distL="0" distR="0" wp14:anchorId="15A6BDAD" wp14:editId="4299EAB0">
+            <wp:extent cx="5940425" cy="1686560"/>
+            <wp:effectExtent l="0" t="0" r="3175" b="2540"/>
+            <wp:docPr id="2138024620" name="Рисунок 1"/>
             <wp:cNvGraphicFramePr>
               <a:graphicFrameLocks xmlns:a="http://schemas.openxmlformats.org/drawingml/2006/main" noChangeAspect="1"/>
             </wp:cNvGraphicFramePr>
@@ -3407,7 +3367,7 @@
               <a:graphicData uri="http://schemas.openxmlformats.org/drawingml/2006/picture">
                 <pic:pic xmlns:pic="http://schemas.openxmlformats.org/drawingml/2006/picture">
                   <pic:nvPicPr>
-                    <pic:cNvPr id="855013758" name=""/>
+                    <pic:cNvPr id="2138024620" name=""/>
                     <pic:cNvPicPr/>
                   </pic:nvPicPr>
                   <pic:blipFill>
@@ -3419,7 +3379,7 @@
                   <pic:spPr>
                     <a:xfrm>
                       <a:off x="0" y="0"/>
-                      <a:ext cx="6052469" cy="3870862"/>
+                      <a:ext cx="5940425" cy="1686560"/>
                     </a:xfrm>
                     <a:prstGeom prst="rect">
                       <a:avLst/>
@@ -3440,814 +3400,47 @@
         <w:rPr>
           <w:rFonts w:cs="Segoe UI"/>
           <w:color w:val="212529"/>
-        </w:rPr>
-      </w:pPr>
-      <w:r>
-        <w:rPr>
-          <w:rFonts w:cs="Segoe UI"/>
-          <w:color w:val="212529"/>
-        </w:rPr>
-        <w:t>Рис. 4.</w:t>
-      </w:r>
-      <w:r>
-        <w:rPr>
-          <w:rFonts w:cs="Segoe UI"/>
-          <w:color w:val="212529"/>
-        </w:rPr>
-        <w:t>3</w:t>
-      </w:r>
-      <w:r>
-        <w:rPr>
-          <w:rFonts w:cs="Segoe UI"/>
-          <w:color w:val="212529"/>
-        </w:rPr>
-        <w:t xml:space="preserve"> – показатели до исправления</w:t>
-      </w:r>
-    </w:p>
-    <w:p>
-      <w:pPr>
-        <w:shd w:val="clear" w:color="auto" w:fill="FFFFFF"/>
-        <w:spacing w:before="100" w:beforeAutospacing="1" w:after="100" w:afterAutospacing="1" w:line="240" w:lineRule="auto"/>
-        <w:rPr>
-          <w:rFonts w:cs="Segoe UI"/>
-          <w:color w:val="212529"/>
-        </w:rPr>
-      </w:pPr>
-      <w:r>
-        <w:rPr>
-          <w:rFonts w:cs="Segoe UI"/>
-          <w:color w:val="212529"/>
-        </w:rPr>
-        <w:t xml:space="preserve">Основной подозрительный </w:t>
-      </w:r>
-      <w:r>
-        <w:rPr>
-          <w:rFonts w:cs="Segoe UI"/>
-          <w:color w:val="212529"/>
-        </w:rPr>
-        <w:t xml:space="preserve">признак </w:t>
-      </w:r>
-      <w:r>
-        <w:rPr>
-          <w:rFonts w:cs="Segoe UI"/>
-          <w:color w:val="212529"/>
-        </w:rPr>
-        <w:t>удалось найти</w:t>
-      </w:r>
-      <w:r>
-        <w:rPr>
-          <w:rFonts w:cs="Segoe UI"/>
-          <w:color w:val="212529"/>
-        </w:rPr>
-        <w:t xml:space="preserve"> на графике </w:t>
-      </w:r>
-      <w:proofErr w:type="spellStart"/>
-      <w:r>
-        <w:rPr>
-          <w:rFonts w:cs="Segoe UI"/>
-          <w:color w:val="212529"/>
-        </w:rPr>
-        <w:t>Classes</w:t>
-      </w:r>
-      <w:proofErr w:type="spellEnd"/>
-      <w:r>
-        <w:rPr>
-          <w:rFonts w:cs="Segoe UI"/>
-          <w:color w:val="212529"/>
-        </w:rPr>
-        <w:t>: количество загруженных классов постоянно увеличива</w:t>
-      </w:r>
-      <w:r>
-        <w:rPr>
-          <w:rFonts w:cs="Segoe UI"/>
-          <w:color w:val="212529"/>
-        </w:rPr>
-        <w:t>ется</w:t>
-      </w:r>
-      <w:r>
-        <w:rPr>
-          <w:rFonts w:cs="Segoe UI"/>
-          <w:color w:val="212529"/>
-        </w:rPr>
-        <w:t>. Это указыва</w:t>
-      </w:r>
-      <w:r>
-        <w:rPr>
-          <w:rFonts w:cs="Segoe UI"/>
-          <w:color w:val="212529"/>
-        </w:rPr>
-        <w:t>ет</w:t>
-      </w:r>
-      <w:r>
-        <w:rPr>
-          <w:rFonts w:cs="Segoe UI"/>
-          <w:color w:val="212529"/>
-        </w:rPr>
-        <w:t xml:space="preserve"> на возможную проблему с </w:t>
-      </w:r>
-      <w:proofErr w:type="spellStart"/>
-      <w:r>
-        <w:rPr>
-          <w:rFonts w:cs="Segoe UI"/>
-          <w:color w:val="212529"/>
-        </w:rPr>
-        <w:t>Metaspace</w:t>
-      </w:r>
-      <w:proofErr w:type="spellEnd"/>
-      <w:r>
-        <w:rPr>
-          <w:rFonts w:cs="Segoe UI"/>
-          <w:color w:val="212529"/>
-        </w:rPr>
-        <w:t xml:space="preserve"> или динамической загрузкой классов.</w:t>
-      </w:r>
-    </w:p>
-    <w:p>
-      <w:pPr>
-        <w:shd w:val="clear" w:color="auto" w:fill="FFFFFF"/>
-        <w:spacing w:before="100" w:beforeAutospacing="1" w:after="100" w:afterAutospacing="1" w:line="240" w:lineRule="auto"/>
-        <w:rPr>
-          <w:rFonts w:cs="Segoe UI"/>
-          <w:color w:val="212529"/>
-        </w:rPr>
-      </w:pPr>
-      <w:r>
-        <w:rPr>
-          <w:rFonts w:cs="Segoe UI"/>
-          <w:color w:val="212529"/>
-        </w:rPr>
-        <w:t>Основная проблема – в</w:t>
-      </w:r>
-      <w:r>
-        <w:rPr>
-          <w:rFonts w:cs="Segoe UI"/>
-          <w:color w:val="212529"/>
-        </w:rPr>
-        <w:t xml:space="preserve">ызов </w:t>
-      </w:r>
-      <w:proofErr w:type="spellStart"/>
-      <w:r>
-        <w:rPr>
-          <w:rFonts w:cs="Segoe UI"/>
-          <w:color w:val="212529"/>
-        </w:rPr>
-        <w:t>ServletUnitClient.getResponse</w:t>
-      </w:r>
-      <w:proofErr w:type="spellEnd"/>
-      <w:r>
-        <w:rPr>
-          <w:rFonts w:cs="Segoe UI"/>
-          <w:color w:val="212529"/>
-        </w:rPr>
-        <w:t xml:space="preserve">(...), внутри которого </w:t>
-      </w:r>
-      <w:proofErr w:type="spellStart"/>
-      <w:r>
-        <w:rPr>
-          <w:rFonts w:cs="Segoe UI"/>
-          <w:color w:val="212529"/>
-        </w:rPr>
-        <w:t>HttpUnit</w:t>
-      </w:r>
-      <w:proofErr w:type="spellEnd"/>
-      <w:r>
-        <w:rPr>
-          <w:rFonts w:cs="Segoe UI"/>
-          <w:color w:val="212529"/>
-        </w:rPr>
-        <w:t xml:space="preserve"> разбирал HTML-ответ </w:t>
-      </w:r>
-      <w:proofErr w:type="spellStart"/>
-      <w:r>
-        <w:rPr>
-          <w:rFonts w:cs="Segoe UI"/>
-          <w:color w:val="212529"/>
-        </w:rPr>
-        <w:t>сервлета</w:t>
-      </w:r>
-      <w:proofErr w:type="spellEnd"/>
-      <w:r>
-        <w:rPr>
-          <w:rFonts w:cs="Segoe UI"/>
-          <w:color w:val="212529"/>
-        </w:rPr>
-        <w:t xml:space="preserve">. Далее профилировщик показал переход к </w:t>
-      </w:r>
-      <w:proofErr w:type="spellStart"/>
-      <w:r>
-        <w:rPr>
-          <w:rFonts w:cs="Segoe UI"/>
-          <w:color w:val="212529"/>
-        </w:rPr>
-        <w:t>ScriptFilter.getTranslatedScript</w:t>
-      </w:r>
-      <w:proofErr w:type="spellEnd"/>
-      <w:r>
-        <w:rPr>
-          <w:rFonts w:cs="Segoe UI"/>
-          <w:color w:val="212529"/>
-        </w:rPr>
-        <w:t xml:space="preserve">(...) и </w:t>
-      </w:r>
-      <w:proofErr w:type="spellStart"/>
-      <w:r>
-        <w:rPr>
-          <w:rFonts w:cs="Segoe UI"/>
-          <w:color w:val="212529"/>
-        </w:rPr>
-        <w:t>Context.evaluateString</w:t>
-      </w:r>
-      <w:proofErr w:type="spellEnd"/>
-      <w:r>
-        <w:rPr>
-          <w:rFonts w:cs="Segoe UI"/>
-          <w:color w:val="212529"/>
-        </w:rPr>
-        <w:t>(...), то есть к обработке JavaScript.</w:t>
-      </w:r>
-    </w:p>
-    <w:p>
-      <w:pPr>
-        <w:shd w:val="clear" w:color="auto" w:fill="FFFFFF"/>
-        <w:spacing w:before="100" w:beforeAutospacing="1" w:after="100" w:afterAutospacing="1" w:line="240" w:lineRule="auto"/>
-        <w:rPr>
-          <w:rFonts w:cs="Segoe UI"/>
-          <w:color w:val="212529"/>
-        </w:rPr>
-      </w:pPr>
-      <w:r>
-        <w:rPr>
-          <w:rFonts w:cs="Segoe UI"/>
-          <w:color w:val="212529"/>
-        </w:rPr>
-        <w:t xml:space="preserve">После проверки HelloWorld.java было найдено, что </w:t>
-      </w:r>
-      <w:proofErr w:type="spellStart"/>
-      <w:r>
-        <w:rPr>
-          <w:rFonts w:cs="Segoe UI"/>
-          <w:color w:val="212529"/>
-        </w:rPr>
-        <w:t>сервлет</w:t>
-      </w:r>
-      <w:proofErr w:type="spellEnd"/>
-      <w:r>
-        <w:rPr>
-          <w:rFonts w:cs="Segoe UI"/>
-          <w:color w:val="212529"/>
-        </w:rPr>
-        <w:t xml:space="preserve"> возвращает JavaScript:</w:t>
-      </w:r>
-    </w:p>
-    <w:p>
-      <w:pPr>
-        <w:shd w:val="clear" w:color="auto" w:fill="FFFFFF"/>
-        <w:spacing w:before="100" w:beforeAutospacing="1" w:after="100" w:afterAutospacing="1" w:line="240" w:lineRule="auto"/>
-        <w:rPr>
-          <w:rFonts w:cs="Segoe UI"/>
-          <w:color w:val="212529"/>
-        </w:rPr>
-      </w:pPr>
-      <w:proofErr w:type="spellStart"/>
-      <w:proofErr w:type="gramStart"/>
-      <w:r>
-        <w:rPr>
-          <w:rFonts w:cs="Segoe UI"/>
-          <w:color w:val="212529"/>
-        </w:rPr>
-        <w:t>document.wr</w:t>
-      </w:r>
-      <w:proofErr w:type="spellEnd"/>
-      <w:proofErr w:type="gramEnd"/>
-      <w:r>
-        <w:rPr>
-          <w:rFonts w:cs="Segoe UI"/>
-          <w:color w:val="212529"/>
-        </w:rPr>
-        <w:t>('Hello Document')</w:t>
-      </w:r>
-    </w:p>
-    <w:p>
-      <w:pPr>
-        <w:shd w:val="clear" w:color="auto" w:fill="FFFFFF"/>
-        <w:spacing w:before="100" w:beforeAutospacing="1" w:after="100" w:afterAutospacing="1" w:line="240" w:lineRule="auto"/>
-        <w:rPr>
-          <w:rFonts w:cs="Segoe UI"/>
-          <w:color w:val="212529"/>
-        </w:rPr>
-      </w:pPr>
-      <w:r>
-        <w:rPr>
-          <w:rFonts w:cs="Segoe UI"/>
-          <w:color w:val="212529"/>
-        </w:rPr>
-        <w:t xml:space="preserve">В коде была ошибка: вместо </w:t>
-      </w:r>
-      <w:proofErr w:type="spellStart"/>
-      <w:proofErr w:type="gramStart"/>
-      <w:r>
-        <w:rPr>
-          <w:rFonts w:cs="Segoe UI"/>
-          <w:color w:val="212529"/>
-        </w:rPr>
-        <w:t>document.write</w:t>
-      </w:r>
-      <w:proofErr w:type="spellEnd"/>
-      <w:proofErr w:type="gramEnd"/>
-      <w:r>
-        <w:rPr>
-          <w:rFonts w:cs="Segoe UI"/>
-          <w:color w:val="212529"/>
-        </w:rPr>
-        <w:t xml:space="preserve">(...) использовался несуществующий метод </w:t>
-      </w:r>
-      <w:proofErr w:type="spellStart"/>
-      <w:proofErr w:type="gramStart"/>
-      <w:r>
-        <w:rPr>
-          <w:rFonts w:cs="Segoe UI"/>
-          <w:color w:val="212529"/>
-        </w:rPr>
-        <w:t>document.wr</w:t>
-      </w:r>
-      <w:proofErr w:type="spellEnd"/>
-      <w:proofErr w:type="gramEnd"/>
-      <w:r>
-        <w:rPr>
-          <w:rFonts w:cs="Segoe UI"/>
-          <w:color w:val="212529"/>
-        </w:rPr>
-        <w:t xml:space="preserve">(...). Кроме того, сам JavaScript был лишним, так как он просто выводил статический текст. Из-за этого </w:t>
-      </w:r>
-      <w:proofErr w:type="spellStart"/>
-      <w:r>
-        <w:rPr>
-          <w:rFonts w:cs="Segoe UI"/>
-          <w:color w:val="212529"/>
-        </w:rPr>
-        <w:t>HttpUnit</w:t>
-      </w:r>
-      <w:proofErr w:type="spellEnd"/>
-      <w:r>
-        <w:rPr>
-          <w:rFonts w:cs="Segoe UI"/>
-          <w:color w:val="212529"/>
-        </w:rPr>
-        <w:t xml:space="preserve"> при каждом запросе пытался обработать скрипт, что приводило к лишним аллокациям и росту количества загруженных классов.</w:t>
-      </w:r>
-    </w:p>
-    <w:p>
-      <w:pPr>
-        <w:shd w:val="clear" w:color="auto" w:fill="FFFFFF"/>
-        <w:spacing w:before="100" w:beforeAutospacing="1" w:after="100" w:afterAutospacing="1" w:line="240" w:lineRule="auto"/>
-        <w:rPr>
-          <w:rFonts w:cs="Segoe UI"/>
-          <w:color w:val="212529"/>
-        </w:rPr>
-      </w:pPr>
-    </w:p>
-    <w:p>
-      <w:pPr>
-        <w:shd w:val="clear" w:color="auto" w:fill="FFFFFF"/>
-        <w:spacing w:before="100" w:beforeAutospacing="1" w:after="100" w:afterAutospacing="1" w:line="240" w:lineRule="auto"/>
-        <w:rPr>
-          <w:rFonts w:cs="Segoe UI"/>
-          <w:color w:val="212529"/>
-        </w:rPr>
-      </w:pPr>
-    </w:p>
-    <w:p>
-      <w:pPr>
-        <w:shd w:val="clear" w:color="auto" w:fill="FFFFFF"/>
-        <w:spacing w:before="100" w:beforeAutospacing="1" w:after="100" w:afterAutospacing="1" w:line="240" w:lineRule="auto"/>
-        <w:rPr>
-          <w:rFonts w:cs="Segoe UI"/>
-          <w:color w:val="212529"/>
-        </w:rPr>
-      </w:pPr>
-    </w:p>
-    <w:p>
-      <w:pPr>
-        <w:shd w:val="clear" w:color="auto" w:fill="FFFFFF"/>
-        <w:spacing w:before="100" w:beforeAutospacing="1" w:after="100" w:afterAutospacing="1" w:line="240" w:lineRule="auto"/>
-        <w:rPr>
-          <w:rFonts w:cs="Segoe UI"/>
-          <w:color w:val="212529"/>
-        </w:rPr>
-      </w:pPr>
-    </w:p>
-    <w:p>
-      <w:pPr>
-        <w:shd w:val="clear" w:color="auto" w:fill="FFFFFF"/>
-        <w:spacing w:before="100" w:beforeAutospacing="1" w:after="100" w:afterAutospacing="1" w:line="240" w:lineRule="auto"/>
-        <w:rPr>
-          <w:rFonts w:cs="Segoe UI"/>
-          <w:b/>
-          <w:bCs/>
-          <w:color w:val="212529"/>
-          <w:sz w:val="32"/>
-          <w:szCs w:val="32"/>
-        </w:rPr>
-      </w:pPr>
-      <w:r>
-        <w:rPr>
-          <w:rFonts w:cs="Segoe UI"/>
-          <w:b/>
-          <w:bCs/>
-          <w:color w:val="212529"/>
-          <w:sz w:val="32"/>
-          <w:szCs w:val="32"/>
-        </w:rPr>
-        <w:lastRenderedPageBreak/>
-        <w:t>Исправление:</w:t>
-      </w:r>
-    </w:p>
-    <w:p>
-      <w:pPr>
-        <w:shd w:val="clear" w:color="auto" w:fill="FFFFFF"/>
-        <w:spacing w:before="100" w:beforeAutospacing="1" w:after="100" w:afterAutospacing="1" w:line="240" w:lineRule="auto"/>
-        <w:rPr>
-          <w:rFonts w:cs="Segoe UI"/>
-          <w:color w:val="212529"/>
-        </w:rPr>
-      </w:pPr>
-      <w:r>
-        <w:rPr>
-          <w:rFonts w:cs="Segoe UI"/>
-          <w:color w:val="212529"/>
-        </w:rPr>
-        <w:t xml:space="preserve">Проблема была устранена на двух уровнях: в ответе </w:t>
-      </w:r>
-      <w:proofErr w:type="spellStart"/>
-      <w:r>
-        <w:rPr>
-          <w:rFonts w:cs="Segoe UI"/>
-          <w:color w:val="212529"/>
-        </w:rPr>
-        <w:t>сервлета</w:t>
-      </w:r>
-      <w:proofErr w:type="spellEnd"/>
-      <w:r>
-        <w:rPr>
-          <w:rFonts w:cs="Segoe UI"/>
-          <w:color w:val="212529"/>
-        </w:rPr>
-        <w:t xml:space="preserve"> и в настройках клиента.</w:t>
-      </w:r>
-    </w:p>
-    <w:p>
-      <w:pPr>
-        <w:shd w:val="clear" w:color="auto" w:fill="FFFFFF"/>
-        <w:spacing w:before="100" w:beforeAutospacing="1" w:after="100" w:afterAutospacing="1" w:line="240" w:lineRule="auto"/>
-        <w:rPr>
-          <w:rFonts w:cs="Segoe UI"/>
-          <w:color w:val="212529"/>
-        </w:rPr>
-      </w:pPr>
-      <w:r>
-        <w:rPr>
-          <w:rFonts w:cs="Segoe UI"/>
-          <w:color w:val="212529"/>
-        </w:rPr>
-        <w:t>В HelloWorld.java JavaScript был заменён на обычный HTML:</w:t>
-      </w:r>
-    </w:p>
-    <w:p>
-      <w:pPr>
-        <w:shd w:val="clear" w:color="auto" w:fill="FFFFFF"/>
-        <w:spacing w:before="100" w:beforeAutospacing="1" w:after="100" w:afterAutospacing="1" w:line="240" w:lineRule="auto"/>
-        <w:rPr>
-          <w:rFonts w:cs="Segoe UI"/>
-          <w:color w:val="212529"/>
           <w:lang w:val="en-US"/>
         </w:rPr>
       </w:pPr>
-      <w:proofErr w:type="spellStart"/>
-      <w:proofErr w:type="gramStart"/>
+      <w:r>
+        <w:rPr>
+          <w:rFonts w:cs="Segoe UI"/>
+          <w:color w:val="212529"/>
+        </w:rPr>
+        <w:t xml:space="preserve">Рис. 4.3 – </w:t>
+      </w:r>
       <w:r>
         <w:rPr>
           <w:rFonts w:cs="Segoe UI"/>
           <w:color w:val="212529"/>
           <w:lang w:val="en-US"/>
         </w:rPr>
-        <w:t>out.println</w:t>
-      </w:r>
-      <w:proofErr w:type="spellEnd"/>
-      <w:proofErr w:type="gramEnd"/>
-      <w:r>
+        <w:t>Call Tree</w:t>
+      </w:r>
+    </w:p>
+    <w:p>
+      <w:pPr>
+        <w:shd w:val="clear" w:color="auto" w:fill="FFFFFF"/>
+        <w:spacing w:before="100" w:beforeAutospacing="1" w:after="100" w:afterAutospacing="1" w:line="240" w:lineRule="auto"/>
+        <w:jc w:val="center"/>
         <w:rPr>
           <w:rFonts w:cs="Segoe UI"/>
           <w:color w:val="212529"/>
           <w:lang w:val="en-US"/>
         </w:rPr>
-        <w:t>("&lt;P&gt;Hello Document&lt;/P&gt;");</w:t>
-      </w:r>
-    </w:p>
-    <w:p>
-      <w:pPr>
-        <w:shd w:val="clear" w:color="auto" w:fill="FFFFFF"/>
-        <w:spacing w:before="100" w:beforeAutospacing="1" w:after="100" w:afterAutospacing="1" w:line="240" w:lineRule="auto"/>
-        <w:rPr>
-          <w:rFonts w:cs="Segoe UI"/>
-          <w:color w:val="212529"/>
-        </w:rPr>
-      </w:pPr>
-      <w:r>
-        <w:rPr>
-          <w:rFonts w:cs="Segoe UI"/>
-          <w:color w:val="212529"/>
-        </w:rPr>
-        <w:t xml:space="preserve">Так как текст статический, использование JavaScript здесь не требуется. После этой замены </w:t>
-      </w:r>
-      <w:proofErr w:type="spellStart"/>
-      <w:r>
-        <w:rPr>
-          <w:rFonts w:cs="Segoe UI"/>
-          <w:color w:val="212529"/>
-        </w:rPr>
-        <w:t>HttpUnit</w:t>
-      </w:r>
-      <w:r>
-        <w:rPr>
-          <w:rFonts w:cs="Segoe UI"/>
-          <w:color w:val="212529"/>
-        </w:rPr>
-        <w:t>.</w:t>
-      </w:r>
-      <w:proofErr w:type="spellEnd"/>
-    </w:p>
-    <w:p>
-      <w:pPr>
-        <w:shd w:val="clear" w:color="auto" w:fill="FFFFFF"/>
-        <w:spacing w:before="100" w:beforeAutospacing="1" w:after="100" w:afterAutospacing="1" w:line="240" w:lineRule="auto"/>
-        <w:rPr>
-          <w:rFonts w:cs="Segoe UI"/>
-          <w:color w:val="212529"/>
-        </w:rPr>
-      </w:pPr>
-      <w:r>
-        <w:rPr>
-          <w:rFonts w:cs="Segoe UI"/>
-          <w:color w:val="212529"/>
-        </w:rPr>
-        <w:t>Дополнительно в Main.java было отключено выполнение JavaScript на стороне клиента:</w:t>
-      </w:r>
-    </w:p>
-    <w:p>
-      <w:pPr>
-        <w:shd w:val="clear" w:color="auto" w:fill="FFFFFF"/>
-        <w:spacing w:before="100" w:beforeAutospacing="1" w:after="100" w:afterAutospacing="1" w:line="240" w:lineRule="auto"/>
+      </w:pPr>
+      <w:r>
         <w:rPr>
           <w:rFonts w:cs="Segoe UI"/>
           <w:color w:val="212529"/>
           <w:lang w:val="en-US"/>
         </w:rPr>
-      </w:pPr>
-      <w:proofErr w:type="spellStart"/>
-      <w:r>
-        <w:rPr>
-          <w:rFonts w:cs="Segoe UI"/>
-          <w:color w:val="212529"/>
-          <w:lang w:val="en-US"/>
-        </w:rPr>
-        <w:t>HttpUnitOptions.setExceptionsThrownOnScriptError</w:t>
-      </w:r>
-      <w:proofErr w:type="spellEnd"/>
-      <w:r>
-        <w:rPr>
-          <w:rFonts w:cs="Segoe UI"/>
-          <w:color w:val="212529"/>
-          <w:lang w:val="en-US"/>
-        </w:rPr>
-        <w:t>(false);</w:t>
-      </w:r>
-      <w:r>
-        <w:rPr>
-          <w:rFonts w:cs="Segoe UI"/>
-          <w:color w:val="212529"/>
-          <w:lang w:val="en-US"/>
-        </w:rPr>
-        <w:br/>
-      </w:r>
-      <w:proofErr w:type="spellStart"/>
-      <w:r>
-        <w:rPr>
-          <w:rFonts w:cs="Segoe UI"/>
-          <w:color w:val="212529"/>
-          <w:lang w:val="en-US"/>
-        </w:rPr>
-        <w:t>HttpUnitOptions.setScriptingEnabled</w:t>
-      </w:r>
-      <w:proofErr w:type="spellEnd"/>
-      <w:r>
-        <w:rPr>
-          <w:rFonts w:cs="Segoe UI"/>
-          <w:color w:val="212529"/>
-          <w:lang w:val="en-US"/>
-        </w:rPr>
-        <w:t>(false);</w:t>
-      </w:r>
-    </w:p>
-    <w:p>
-      <w:pPr>
-        <w:shd w:val="clear" w:color="auto" w:fill="FFFFFF"/>
-        <w:spacing w:before="100" w:beforeAutospacing="1" w:after="100" w:afterAutospacing="1" w:line="240" w:lineRule="auto"/>
-        <w:rPr>
-          <w:rFonts w:cs="Segoe UI"/>
-          <w:color w:val="212529"/>
-        </w:rPr>
-      </w:pPr>
-      <w:r>
-        <w:rPr>
-          <w:rFonts w:cs="Segoe UI"/>
-          <w:color w:val="212529"/>
-        </w:rPr>
-        <w:t xml:space="preserve">Такое решение было принято потому, что программа не проверяет работу JavaScript, а только многократно получает HTML-ответ </w:t>
-      </w:r>
-      <w:proofErr w:type="spellStart"/>
-      <w:r>
-        <w:rPr>
-          <w:rFonts w:cs="Segoe UI"/>
-          <w:color w:val="212529"/>
-        </w:rPr>
-        <w:t>сервлета</w:t>
-      </w:r>
-      <w:proofErr w:type="spellEnd"/>
-      <w:r>
-        <w:rPr>
-          <w:rFonts w:cs="Segoe UI"/>
-          <w:color w:val="212529"/>
-        </w:rPr>
-        <w:t xml:space="preserve">. Поэтому выполнение скриптов в </w:t>
-      </w:r>
-      <w:proofErr w:type="spellStart"/>
-      <w:r>
-        <w:rPr>
-          <w:rFonts w:cs="Segoe UI"/>
-          <w:color w:val="212529"/>
-        </w:rPr>
-        <w:t>HttpUnit</w:t>
-      </w:r>
-      <w:proofErr w:type="spellEnd"/>
-      <w:r>
-        <w:rPr>
-          <w:rFonts w:cs="Segoe UI"/>
-          <w:color w:val="212529"/>
-        </w:rPr>
-        <w:t xml:space="preserve"> является лишней операцией. Замена скрипта устраняет источник проблемы, а отключение JavaScript на клиенте защищает программу от повторения такой ситуации.</w:t>
-      </w:r>
-    </w:p>
-    <w:p>
-      <w:pPr>
-        <w:shd w:val="clear" w:color="auto" w:fill="FFFFFF"/>
-        <w:spacing w:before="100" w:beforeAutospacing="1" w:after="100" w:afterAutospacing="1" w:line="240" w:lineRule="auto"/>
-        <w:rPr>
-          <w:rFonts w:cs="Segoe UI"/>
-          <w:color w:val="212529"/>
-        </w:rPr>
-      </w:pPr>
-    </w:p>
-    <w:p>
-      <w:pPr>
-        <w:shd w:val="clear" w:color="auto" w:fill="FFFFFF"/>
-        <w:spacing w:before="100" w:beforeAutospacing="1" w:after="100" w:afterAutospacing="1" w:line="240" w:lineRule="auto"/>
-        <w:rPr>
-          <w:rFonts w:cs="Segoe UI"/>
-          <w:color w:val="212529"/>
-        </w:rPr>
-      </w:pPr>
-    </w:p>
-    <w:p>
-      <w:pPr>
-        <w:shd w:val="clear" w:color="auto" w:fill="FFFFFF"/>
-        <w:spacing w:before="100" w:beforeAutospacing="1" w:after="100" w:afterAutospacing="1" w:line="240" w:lineRule="auto"/>
-        <w:rPr>
-          <w:rFonts w:cs="Segoe UI"/>
-          <w:color w:val="212529"/>
-        </w:rPr>
-      </w:pPr>
-    </w:p>
-    <w:p>
-      <w:pPr>
-        <w:shd w:val="clear" w:color="auto" w:fill="FFFFFF"/>
-        <w:spacing w:before="100" w:beforeAutospacing="1" w:after="100" w:afterAutospacing="1" w:line="240" w:lineRule="auto"/>
-        <w:rPr>
-          <w:rFonts w:cs="Segoe UI"/>
-          <w:color w:val="212529"/>
-        </w:rPr>
-      </w:pPr>
-    </w:p>
-    <w:p>
-      <w:pPr>
-        <w:shd w:val="clear" w:color="auto" w:fill="FFFFFF"/>
-        <w:spacing w:before="100" w:beforeAutospacing="1" w:after="100" w:afterAutospacing="1" w:line="240" w:lineRule="auto"/>
-        <w:rPr>
-          <w:rFonts w:cs="Segoe UI"/>
-          <w:color w:val="212529"/>
-        </w:rPr>
-      </w:pPr>
-    </w:p>
-    <w:p>
-      <w:pPr>
-        <w:shd w:val="clear" w:color="auto" w:fill="FFFFFF"/>
-        <w:spacing w:before="100" w:beforeAutospacing="1" w:after="100" w:afterAutospacing="1" w:line="240" w:lineRule="auto"/>
-        <w:rPr>
-          <w:rFonts w:cs="Segoe UI"/>
-          <w:color w:val="212529"/>
-        </w:rPr>
-      </w:pPr>
-    </w:p>
-    <w:p>
-      <w:pPr>
-        <w:shd w:val="clear" w:color="auto" w:fill="FFFFFF"/>
-        <w:spacing w:before="100" w:beforeAutospacing="1" w:after="100" w:afterAutospacing="1" w:line="240" w:lineRule="auto"/>
-        <w:rPr>
-          <w:rFonts w:cs="Segoe UI"/>
-          <w:color w:val="212529"/>
-        </w:rPr>
-      </w:pPr>
-    </w:p>
-    <w:p>
-      <w:pPr>
-        <w:shd w:val="clear" w:color="auto" w:fill="FFFFFF"/>
-        <w:spacing w:before="100" w:beforeAutospacing="1" w:after="100" w:afterAutospacing="1" w:line="240" w:lineRule="auto"/>
-        <w:rPr>
-          <w:rFonts w:cs="Segoe UI"/>
-          <w:color w:val="212529"/>
-        </w:rPr>
-      </w:pPr>
-    </w:p>
-    <w:p>
-      <w:pPr>
-        <w:shd w:val="clear" w:color="auto" w:fill="FFFFFF"/>
-        <w:spacing w:before="100" w:beforeAutospacing="1" w:after="100" w:afterAutospacing="1" w:line="240" w:lineRule="auto"/>
-        <w:rPr>
-          <w:rFonts w:cs="Segoe UI"/>
-          <w:color w:val="212529"/>
-        </w:rPr>
-      </w:pPr>
-    </w:p>
-    <w:p>
-      <w:pPr>
-        <w:shd w:val="clear" w:color="auto" w:fill="FFFFFF"/>
-        <w:spacing w:before="100" w:beforeAutospacing="1" w:after="100" w:afterAutospacing="1" w:line="240" w:lineRule="auto"/>
-        <w:rPr>
-          <w:rFonts w:cs="Segoe UI"/>
-          <w:color w:val="212529"/>
-        </w:rPr>
-      </w:pPr>
-    </w:p>
-    <w:p>
-      <w:pPr>
-        <w:shd w:val="clear" w:color="auto" w:fill="FFFFFF"/>
-        <w:spacing w:before="100" w:beforeAutospacing="1" w:after="100" w:afterAutospacing="1" w:line="240" w:lineRule="auto"/>
-        <w:rPr>
-          <w:rFonts w:cs="Segoe UI"/>
-          <w:color w:val="212529"/>
-        </w:rPr>
-      </w:pPr>
-    </w:p>
-    <w:p>
-      <w:pPr>
-        <w:shd w:val="clear" w:color="auto" w:fill="FFFFFF"/>
-        <w:spacing w:before="100" w:beforeAutospacing="1" w:after="100" w:afterAutospacing="1" w:line="240" w:lineRule="auto"/>
-        <w:rPr>
-          <w:rFonts w:cs="Segoe UI"/>
-          <w:color w:val="212529"/>
-        </w:rPr>
-      </w:pPr>
-    </w:p>
-    <w:p>
-      <w:pPr>
-        <w:shd w:val="clear" w:color="auto" w:fill="FFFFFF"/>
-        <w:spacing w:before="100" w:beforeAutospacing="1" w:after="100" w:afterAutospacing="1" w:line="240" w:lineRule="auto"/>
-        <w:rPr>
-          <w:rFonts w:cs="Segoe UI"/>
-          <w:color w:val="212529"/>
-        </w:rPr>
-      </w:pPr>
-    </w:p>
-    <w:p>
-      <w:pPr>
-        <w:shd w:val="clear" w:color="auto" w:fill="FFFFFF"/>
-        <w:spacing w:before="100" w:beforeAutospacing="1" w:after="100" w:afterAutospacing="1" w:line="240" w:lineRule="auto"/>
-        <w:jc w:val="center"/>
-        <w:rPr>
-          <w:rFonts w:cs="Segoe UI"/>
-          <w:color w:val="212529"/>
-        </w:rPr>
-      </w:pPr>
-      <w:r>
-        <w:rPr>
-          <w:rFonts w:cs="Segoe UI"/>
-          <w:color w:val="212529"/>
-        </w:rPr>
-        <w:lastRenderedPageBreak/>
         <w:drawing>
-          <wp:inline distT="0" distB="0" distL="0" distR="0" wp14:anchorId="355DA128" wp14:editId="663BC8D5">
-            <wp:extent cx="5940425" cy="2750185"/>
-            <wp:effectExtent l="0" t="0" r="3175" b="5715"/>
-            <wp:docPr id="522562207" name="Рисунок 1"/>
+          <wp:inline distT="0" distB="0" distL="0" distR="0" wp14:anchorId="7073381E" wp14:editId="27CDA8A8">
+            <wp:extent cx="5940425" cy="925830"/>
+            <wp:effectExtent l="0" t="0" r="3175" b="1270"/>
+            <wp:docPr id="1122193504" name="Рисунок 1"/>
             <wp:cNvGraphicFramePr>
               <a:graphicFrameLocks xmlns:a="http://schemas.openxmlformats.org/drawingml/2006/main" noChangeAspect="1"/>
             </wp:cNvGraphicFramePr>
@@ -4255,7 +3448,7 @@
               <a:graphicData uri="http://schemas.openxmlformats.org/drawingml/2006/picture">
                 <pic:pic xmlns:pic="http://schemas.openxmlformats.org/drawingml/2006/picture">
                   <pic:nvPicPr>
-                    <pic:cNvPr id="522562207" name=""/>
+                    <pic:cNvPr id="1122193504" name=""/>
                     <pic:cNvPicPr/>
                   </pic:nvPicPr>
                   <pic:blipFill>
@@ -4267,7 +3460,7 @@
                   <pic:spPr>
                     <a:xfrm>
                       <a:off x="0" y="0"/>
-                      <a:ext cx="5940425" cy="2750185"/>
+                      <a:ext cx="5940425" cy="925830"/>
                     </a:xfrm>
                     <a:prstGeom prst="rect">
                       <a:avLst/>
@@ -4288,94 +3481,1455 @@
         <w:rPr>
           <w:rFonts w:cs="Segoe UI"/>
           <w:color w:val="212529"/>
+        </w:rPr>
+      </w:pPr>
+      <w:r>
+        <w:rPr>
+          <w:rFonts w:cs="Segoe UI"/>
+          <w:color w:val="212529"/>
+        </w:rPr>
+        <w:t xml:space="preserve">Рис. 4.4 – </w:t>
+      </w:r>
+      <w:r>
+        <w:rPr>
+          <w:rFonts w:cs="Segoe UI"/>
+          <w:color w:val="212529"/>
           <w:lang w:val="en-US"/>
         </w:rPr>
-      </w:pPr>
-      <w:r>
-        <w:rPr>
-          <w:rFonts w:cs="Segoe UI"/>
-          <w:color w:val="212529"/>
-        </w:rPr>
-        <w:t>Рис</w:t>
-      </w:r>
-      <w:r>
+        <w:t>Call Tree</w:t>
+      </w:r>
+    </w:p>
+    <w:p>
+      <w:pPr>
+        <w:shd w:val="clear" w:color="auto" w:fill="FFFFFF"/>
+        <w:spacing w:before="100" w:beforeAutospacing="1" w:after="100" w:afterAutospacing="1" w:line="240" w:lineRule="auto"/>
+        <w:jc w:val="center"/>
+        <w:rPr>
+          <w:rFonts w:cs="Segoe UI"/>
+          <w:color w:val="212529"/>
+        </w:rPr>
+      </w:pPr>
+    </w:p>
+    <w:p>
+      <w:pPr>
+        <w:shd w:val="clear" w:color="auto" w:fill="FFFFFF"/>
+        <w:spacing w:before="100" w:beforeAutospacing="1" w:after="100" w:afterAutospacing="1" w:line="240" w:lineRule="auto"/>
+        <w:jc w:val="center"/>
+        <w:rPr>
+          <w:rFonts w:cs="Segoe UI"/>
+          <w:color w:val="212529"/>
+        </w:rPr>
+      </w:pPr>
+    </w:p>
+    <w:p>
+      <w:pPr>
+        <w:shd w:val="clear" w:color="auto" w:fill="FFFFFF"/>
+        <w:spacing w:before="100" w:beforeAutospacing="1" w:after="100" w:afterAutospacing="1" w:line="240" w:lineRule="auto"/>
+        <w:jc w:val="center"/>
+        <w:rPr>
+          <w:rFonts w:cs="Segoe UI"/>
+          <w:color w:val="212529"/>
+        </w:rPr>
+      </w:pPr>
+    </w:p>
+    <w:p>
+      <w:pPr>
+        <w:shd w:val="clear" w:color="auto" w:fill="FFFFFF"/>
+        <w:spacing w:before="100" w:beforeAutospacing="1" w:after="100" w:afterAutospacing="1" w:line="240" w:lineRule="auto"/>
+        <w:jc w:val="center"/>
+        <w:rPr>
+          <w:rFonts w:cs="Segoe UI"/>
+          <w:color w:val="212529"/>
+        </w:rPr>
+      </w:pPr>
+    </w:p>
+    <w:p>
+      <w:pPr>
+        <w:shd w:val="clear" w:color="auto" w:fill="FFFFFF"/>
+        <w:spacing w:before="100" w:beforeAutospacing="1" w:after="100" w:afterAutospacing="1" w:line="240" w:lineRule="auto"/>
+        <w:jc w:val="center"/>
+        <w:rPr>
+          <w:rFonts w:cs="Segoe UI"/>
+          <w:color w:val="212529"/>
+        </w:rPr>
+      </w:pPr>
+    </w:p>
+    <w:p>
+      <w:pPr>
+        <w:shd w:val="clear" w:color="auto" w:fill="FFFFFF"/>
+        <w:spacing w:before="100" w:beforeAutospacing="1" w:after="100" w:afterAutospacing="1" w:line="240" w:lineRule="auto"/>
+        <w:jc w:val="center"/>
+        <w:rPr>
+          <w:rFonts w:cs="Segoe UI"/>
+          <w:color w:val="212529"/>
+        </w:rPr>
+      </w:pPr>
+    </w:p>
+    <w:p>
+      <w:pPr>
+        <w:shd w:val="clear" w:color="auto" w:fill="FFFFFF"/>
+        <w:spacing w:before="100" w:beforeAutospacing="1" w:after="100" w:afterAutospacing="1" w:line="240" w:lineRule="auto"/>
+        <w:jc w:val="center"/>
+        <w:rPr>
+          <w:rFonts w:cs="Segoe UI"/>
+          <w:color w:val="212529"/>
+        </w:rPr>
+      </w:pPr>
+    </w:p>
+    <w:p>
+      <w:pPr>
+        <w:shd w:val="clear" w:color="auto" w:fill="FFFFFF"/>
+        <w:spacing w:before="100" w:beforeAutospacing="1" w:after="100" w:afterAutospacing="1" w:line="240" w:lineRule="auto"/>
+        <w:jc w:val="center"/>
+        <w:rPr>
+          <w:rFonts w:cs="Segoe UI"/>
+          <w:color w:val="212529"/>
+        </w:rPr>
+      </w:pPr>
+    </w:p>
+    <w:p>
+      <w:pPr>
+        <w:shd w:val="clear" w:color="auto" w:fill="FFFFFF"/>
+        <w:spacing w:before="100" w:beforeAutospacing="1" w:after="100" w:afterAutospacing="1" w:line="240" w:lineRule="auto"/>
+        <w:jc w:val="center"/>
+        <w:rPr>
+          <w:rFonts w:cs="Segoe UI"/>
+          <w:color w:val="212529"/>
+        </w:rPr>
+      </w:pPr>
+    </w:p>
+    <w:p>
+      <w:pPr>
+        <w:shd w:val="clear" w:color="auto" w:fill="FFFFFF"/>
+        <w:spacing w:before="100" w:beforeAutospacing="1" w:after="100" w:afterAutospacing="1" w:line="240" w:lineRule="auto"/>
+        <w:jc w:val="center"/>
+        <w:rPr>
+          <w:rFonts w:cs="Segoe UI"/>
+          <w:color w:val="212529"/>
+        </w:rPr>
+      </w:pPr>
+    </w:p>
+    <w:p>
+      <w:pPr>
+        <w:shd w:val="clear" w:color="auto" w:fill="FFFFFF"/>
+        <w:spacing w:before="100" w:beforeAutospacing="1" w:after="100" w:afterAutospacing="1" w:line="240" w:lineRule="auto"/>
+        <w:jc w:val="center"/>
+        <w:rPr>
+          <w:rFonts w:cs="Segoe UI"/>
+          <w:color w:val="212529"/>
+        </w:rPr>
+      </w:pPr>
+    </w:p>
+    <w:p>
+      <w:pPr>
+        <w:shd w:val="clear" w:color="auto" w:fill="FFFFFF"/>
+        <w:spacing w:before="100" w:beforeAutospacing="1" w:after="100" w:afterAutospacing="1" w:line="240" w:lineRule="auto"/>
+        <w:jc w:val="center"/>
+        <w:rPr>
+          <w:rFonts w:cs="Segoe UI"/>
+          <w:color w:val="212529"/>
+        </w:rPr>
+      </w:pPr>
+    </w:p>
+    <w:p>
+      <w:pPr>
+        <w:shd w:val="clear" w:color="auto" w:fill="FFFFFF"/>
+        <w:spacing w:before="100" w:beforeAutospacing="1" w:after="100" w:afterAutospacing="1" w:line="240" w:lineRule="auto"/>
+        <w:jc w:val="center"/>
+        <w:rPr>
+          <w:rFonts w:cs="Segoe UI"/>
+          <w:color w:val="212529"/>
+        </w:rPr>
+      </w:pPr>
+    </w:p>
+    <w:p>
+      <w:pPr>
+        <w:shd w:val="clear" w:color="auto" w:fill="FFFFFF"/>
+        <w:spacing w:before="100" w:beforeAutospacing="1" w:after="100" w:afterAutospacing="1" w:line="240" w:lineRule="auto"/>
+        <w:jc w:val="center"/>
+        <w:rPr>
+          <w:rFonts w:cs="Segoe UI"/>
+          <w:color w:val="212529"/>
+        </w:rPr>
+      </w:pPr>
+    </w:p>
+    <w:p>
+      <w:pPr>
+        <w:shd w:val="clear" w:color="auto" w:fill="FFFFFF"/>
+        <w:spacing w:before="100" w:beforeAutospacing="1" w:after="100" w:afterAutospacing="1" w:line="240" w:lineRule="auto"/>
+        <w:jc w:val="center"/>
+        <w:rPr>
+          <w:rFonts w:cs="Segoe UI"/>
+          <w:color w:val="212529"/>
+        </w:rPr>
+      </w:pPr>
+    </w:p>
+    <w:p>
+      <w:pPr>
+        <w:shd w:val="clear" w:color="auto" w:fill="FFFFFF"/>
+        <w:spacing w:before="100" w:beforeAutospacing="1" w:after="100" w:afterAutospacing="1" w:line="240" w:lineRule="auto"/>
+        <w:rPr>
+          <w:rFonts w:cs="Segoe UI"/>
+          <w:b/>
+          <w:bCs/>
+          <w:color w:val="212529"/>
+          <w:sz w:val="32"/>
+          <w:szCs w:val="32"/>
+        </w:rPr>
+      </w:pPr>
+      <w:r>
+        <w:rPr>
+          <w:rFonts w:cs="Segoe UI"/>
+          <w:b/>
+          <w:bCs/>
+          <w:color w:val="212529"/>
+          <w:sz w:val="32"/>
+          <w:szCs w:val="32"/>
+        </w:rPr>
+        <w:lastRenderedPageBreak/>
+        <w:t>Локализация</w:t>
+      </w:r>
+      <w:r>
+        <w:rPr>
+          <w:rFonts w:cs="Segoe UI"/>
+          <w:b/>
+          <w:bCs/>
+          <w:color w:val="212529"/>
+          <w:sz w:val="32"/>
+          <w:szCs w:val="32"/>
+        </w:rPr>
+        <w:t>:</w:t>
+      </w:r>
+    </w:p>
+    <w:p>
+      <w:pPr>
+        <w:shd w:val="clear" w:color="auto" w:fill="FFFFFF"/>
+        <w:spacing w:before="100" w:beforeAutospacing="1" w:after="100" w:afterAutospacing="1" w:line="240" w:lineRule="auto"/>
+        <w:rPr>
+          <w:rFonts w:cs="Segoe UI"/>
+          <w:color w:val="212529"/>
+        </w:rPr>
+      </w:pPr>
+      <w:r>
+        <w:rPr>
+          <w:rFonts w:cs="Segoe UI"/>
+          <w:color w:val="212529"/>
+        </w:rPr>
+        <w:t xml:space="preserve">Программа была проанализирована через VisualVM. На графике Heap было видно, что используемая память постоянно растет, а размер heap доходил примерно до 1.68 GB. На графике </w:t>
+      </w:r>
+      <w:proofErr w:type="spellStart"/>
+      <w:r>
+        <w:rPr>
+          <w:rFonts w:cs="Segoe UI"/>
+          <w:color w:val="212529"/>
+        </w:rPr>
+        <w:t>Classes</w:t>
+      </w:r>
+      <w:proofErr w:type="spellEnd"/>
+      <w:r>
+        <w:rPr>
+          <w:rFonts w:cs="Segoe UI"/>
+          <w:color w:val="212529"/>
+        </w:rPr>
+        <w:t xml:space="preserve"> также наблюдался резкий рост количества загруженных классов. Для программы, которая многократно выполняет один и тот же запрос к </w:t>
+      </w:r>
+      <w:proofErr w:type="spellStart"/>
+      <w:r>
+        <w:rPr>
+          <w:rFonts w:cs="Segoe UI"/>
+          <w:color w:val="212529"/>
+        </w:rPr>
+        <w:t>сервлету</w:t>
+      </w:r>
+      <w:proofErr w:type="spellEnd"/>
+      <w:r>
+        <w:rPr>
+          <w:rFonts w:cs="Segoe UI"/>
+          <w:color w:val="212529"/>
+        </w:rPr>
+        <w:t>, такое поведение выглядит аномально.</w:t>
+      </w:r>
+    </w:p>
+    <w:p>
+      <w:pPr>
+        <w:shd w:val="clear" w:color="auto" w:fill="FFFFFF"/>
+        <w:spacing w:before="100" w:beforeAutospacing="1" w:after="100" w:afterAutospacing="1" w:line="240" w:lineRule="auto"/>
+        <w:rPr>
+          <w:rFonts w:cs="Segoe UI"/>
+          <w:color w:val="212529"/>
+        </w:rPr>
+      </w:pPr>
+      <w:r>
+        <w:rPr>
+          <w:rFonts w:cs="Segoe UI"/>
+          <w:color w:val="212529"/>
+        </w:rPr>
+        <w:t xml:space="preserve">Для уточнения причины был использован Call </w:t>
+      </w:r>
+      <w:proofErr w:type="spellStart"/>
+      <w:r>
+        <w:rPr>
+          <w:rFonts w:cs="Segoe UI"/>
+          <w:color w:val="212529"/>
+        </w:rPr>
+        <w:t>Tree</w:t>
+      </w:r>
+      <w:proofErr w:type="spellEnd"/>
+      <w:r>
+        <w:rPr>
+          <w:rFonts w:cs="Segoe UI"/>
+          <w:color w:val="212529"/>
+        </w:rPr>
+        <w:t xml:space="preserve"> профилировщика </w:t>
+      </w:r>
+      <w:proofErr w:type="spellStart"/>
+      <w:r>
+        <w:rPr>
+          <w:rFonts w:cs="Segoe UI"/>
+          <w:color w:val="212529"/>
+        </w:rPr>
+        <w:t>IntelliJ</w:t>
+      </w:r>
+      <w:proofErr w:type="spellEnd"/>
+      <w:r>
+        <w:rPr>
+          <w:rFonts w:cs="Segoe UI"/>
+          <w:color w:val="212529"/>
+        </w:rPr>
+        <w:t xml:space="preserve"> IDEA. Основная цепочка выполнения проходила не через пользовательский код, а через </w:t>
+      </w:r>
+      <w:proofErr w:type="spellStart"/>
+      <w:r>
+        <w:rPr>
+          <w:rFonts w:cs="Segoe UI"/>
+          <w:color w:val="212529"/>
+        </w:rPr>
+        <w:t>HttpUnit</w:t>
+      </w:r>
+      <w:proofErr w:type="spellEnd"/>
+      <w:r>
+        <w:rPr>
+          <w:rFonts w:cs="Segoe UI"/>
+          <w:color w:val="212529"/>
+        </w:rPr>
+        <w:t>:</w:t>
+      </w:r>
+    </w:p>
+    <w:p>
+      <w:pPr>
+        <w:shd w:val="clear" w:color="auto" w:fill="FFFFFF"/>
+        <w:spacing w:before="100" w:beforeAutospacing="1" w:after="100" w:afterAutospacing="1" w:line="240" w:lineRule="auto"/>
         <w:rPr>
           <w:rFonts w:cs="Segoe UI"/>
           <w:color w:val="212529"/>
           <w:lang w:val="en-US"/>
         </w:rPr>
-        <w:t>. 4.</w:t>
-      </w:r>
+      </w:pPr>
+      <w:proofErr w:type="spellStart"/>
       <w:r>
         <w:rPr>
           <w:rFonts w:cs="Segoe UI"/>
           <w:color w:val="212529"/>
           <w:lang w:val="en-US"/>
         </w:rPr>
-        <w:t>4</w:t>
-      </w:r>
+        <w:t>WebResponse.getFrameRequests</w:t>
+      </w:r>
+      <w:proofErr w:type="spellEnd"/>
       <w:r>
         <w:rPr>
           <w:rFonts w:cs="Segoe UI"/>
           <w:color w:val="212529"/>
           <w:lang w:val="en-US"/>
         </w:rPr>
-        <w:t xml:space="preserve"> – </w:t>
-      </w:r>
-      <w:r>
+        <w:t>()</w:t>
+      </w:r>
+    </w:p>
+    <w:p>
+      <w:pPr>
+        <w:shd w:val="clear" w:color="auto" w:fill="FFFFFF"/>
+        <w:spacing w:before="100" w:beforeAutospacing="1" w:after="100" w:afterAutospacing="1" w:line="240" w:lineRule="auto"/>
         <w:rPr>
           <w:rFonts w:cs="Segoe UI"/>
           <w:color w:val="212529"/>
           <w:lang w:val="en-US"/>
         </w:rPr>
-        <w:t xml:space="preserve">Call Tree </w:t>
-      </w:r>
-      <w:r>
-        <w:rPr>
-          <w:rFonts w:cs="Segoe UI"/>
-          <w:color w:val="212529"/>
-        </w:rPr>
-        <w:t>по</w:t>
-      </w:r>
+      </w:pPr>
       <w:r>
         <w:rPr>
           <w:rFonts w:cs="Segoe UI"/>
           <w:color w:val="212529"/>
           <w:lang w:val="en-US"/>
         </w:rPr>
+        <w:t xml:space="preserve"> -&gt; </w:t>
+      </w:r>
+      <w:proofErr w:type="spellStart"/>
+      <w:r>
+        <w:rPr>
+          <w:rFonts w:cs="Segoe UI"/>
+          <w:color w:val="212529"/>
+          <w:lang w:val="en-US"/>
+        </w:rPr>
+        <w:t>DOMParser.parse</w:t>
+      </w:r>
+      <w:proofErr w:type="spellEnd"/>
+      <w:r>
+        <w:rPr>
+          <w:rFonts w:cs="Segoe UI"/>
+          <w:color w:val="212529"/>
+          <w:lang w:val="en-US"/>
+        </w:rPr>
+        <w:t>(...)</w:t>
+      </w:r>
+    </w:p>
+    <w:p>
+      <w:pPr>
+        <w:shd w:val="clear" w:color="auto" w:fill="FFFFFF"/>
+        <w:spacing w:before="100" w:beforeAutospacing="1" w:after="100" w:afterAutospacing="1" w:line="240" w:lineRule="auto"/>
+        <w:rPr>
+          <w:rFonts w:cs="Segoe UI"/>
+          <w:color w:val="212529"/>
+          <w:lang w:val="en-US"/>
+        </w:rPr>
+      </w:pPr>
+      <w:r>
+        <w:rPr>
+          <w:rFonts w:cs="Segoe UI"/>
+          <w:color w:val="212529"/>
+          <w:lang w:val="en-US"/>
+        </w:rPr>
+        <w:t xml:space="preserve"> -&gt; </w:t>
+      </w:r>
+      <w:proofErr w:type="spellStart"/>
+      <w:r>
+        <w:rPr>
+          <w:rFonts w:cs="Segoe UI"/>
+          <w:color w:val="212529"/>
+          <w:lang w:val="en-US"/>
+        </w:rPr>
+        <w:t>ScriptFilter.getTranslatedScript</w:t>
+      </w:r>
+      <w:proofErr w:type="spellEnd"/>
+      <w:r>
+        <w:rPr>
+          <w:rFonts w:cs="Segoe UI"/>
+          <w:color w:val="212529"/>
+          <w:lang w:val="en-US"/>
+        </w:rPr>
+        <w:t>(...)</w:t>
+      </w:r>
+    </w:p>
+    <w:p>
+      <w:pPr>
+        <w:shd w:val="clear" w:color="auto" w:fill="FFFFFF"/>
+        <w:spacing w:before="100" w:beforeAutospacing="1" w:after="100" w:afterAutospacing="1" w:line="240" w:lineRule="auto"/>
+        <w:rPr>
+          <w:rFonts w:cs="Segoe UI"/>
+          <w:color w:val="212529"/>
+        </w:rPr>
+      </w:pPr>
+      <w:r>
+        <w:rPr>
+          <w:rFonts w:cs="Segoe UI"/>
+          <w:color w:val="212529"/>
+          <w:lang w:val="en-US"/>
+        </w:rPr>
         <w:t xml:space="preserve"> </w:t>
       </w:r>
       <w:r>
         <w:rPr>
           <w:rFonts w:cs="Segoe UI"/>
           <w:color w:val="212529"/>
+        </w:rPr>
+        <w:t xml:space="preserve">-&gt; </w:t>
+      </w:r>
+      <w:proofErr w:type="spellStart"/>
+      <w:r>
+        <w:rPr>
+          <w:rFonts w:cs="Segoe UI"/>
+          <w:color w:val="212529"/>
+        </w:rPr>
+        <w:t>Context.evaluateString</w:t>
+      </w:r>
+      <w:proofErr w:type="spellEnd"/>
+      <w:r>
+        <w:rPr>
+          <w:rFonts w:cs="Segoe UI"/>
+          <w:color w:val="212529"/>
+        </w:rPr>
+        <w:t>(...)</w:t>
+      </w:r>
+    </w:p>
+    <w:p>
+      <w:pPr>
+        <w:shd w:val="clear" w:color="auto" w:fill="FFFFFF"/>
+        <w:spacing w:before="100" w:beforeAutospacing="1" w:after="100" w:afterAutospacing="1" w:line="240" w:lineRule="auto"/>
+        <w:rPr>
+          <w:rFonts w:cs="Segoe UI"/>
+          <w:color w:val="212529"/>
+        </w:rPr>
+      </w:pPr>
+      <w:r>
+        <w:rPr>
+          <w:rFonts w:cs="Segoe UI"/>
+          <w:color w:val="212529"/>
+        </w:rPr>
+        <w:t xml:space="preserve">Это показало, что основная нагрузка связана с обработкой JavaScript внутри HTML-ответа. В коде </w:t>
+      </w:r>
+      <w:proofErr w:type="spellStart"/>
+      <w:r>
+        <w:rPr>
+          <w:rFonts w:cs="Segoe UI"/>
+          <w:color w:val="212529"/>
+        </w:rPr>
+        <w:t>сервлета</w:t>
+      </w:r>
+      <w:proofErr w:type="spellEnd"/>
+      <w:r>
+        <w:rPr>
+          <w:rFonts w:cs="Segoe UI"/>
+          <w:color w:val="212529"/>
+        </w:rPr>
+        <w:t xml:space="preserve"> был найден ошибочный JavaScript:</w:t>
+      </w:r>
+    </w:p>
+    <w:p>
+      <w:pPr>
+        <w:shd w:val="clear" w:color="auto" w:fill="FFFFFF"/>
+        <w:spacing w:before="100" w:beforeAutospacing="1" w:after="100" w:afterAutospacing="1" w:line="240" w:lineRule="auto"/>
+        <w:rPr>
+          <w:rFonts w:cs="Segoe UI"/>
+          <w:color w:val="212529"/>
+        </w:rPr>
+      </w:pPr>
+      <w:proofErr w:type="spellStart"/>
+      <w:proofErr w:type="gramStart"/>
+      <w:r>
+        <w:rPr>
+          <w:rFonts w:cs="Segoe UI"/>
+          <w:color w:val="212529"/>
+        </w:rPr>
+        <w:t>document.wr</w:t>
+      </w:r>
+      <w:proofErr w:type="spellEnd"/>
+      <w:proofErr w:type="gramEnd"/>
+      <w:r>
+        <w:rPr>
+          <w:rFonts w:cs="Segoe UI"/>
+          <w:color w:val="212529"/>
+        </w:rPr>
+        <w:t>('Hello Document')</w:t>
+      </w:r>
+    </w:p>
+    <w:p>
+      <w:pPr>
+        <w:shd w:val="clear" w:color="auto" w:fill="FFFFFF"/>
+        <w:spacing w:before="100" w:beforeAutospacing="1" w:after="100" w:afterAutospacing="1" w:line="240" w:lineRule="auto"/>
+        <w:rPr>
+          <w:rFonts w:cs="Segoe UI"/>
+          <w:color w:val="212529"/>
+        </w:rPr>
+      </w:pPr>
+      <w:r>
+        <w:rPr>
+          <w:rFonts w:cs="Segoe UI"/>
+          <w:color w:val="212529"/>
+        </w:rPr>
+        <w:t xml:space="preserve">Такого метода не существует, поэтому </w:t>
+      </w:r>
+      <w:proofErr w:type="spellStart"/>
+      <w:r>
+        <w:rPr>
+          <w:rFonts w:cs="Segoe UI"/>
+          <w:color w:val="212529"/>
+        </w:rPr>
+        <w:t>HttpUnit</w:t>
+      </w:r>
+      <w:proofErr w:type="spellEnd"/>
+      <w:r>
+        <w:rPr>
+          <w:rFonts w:cs="Segoe UI"/>
+          <w:color w:val="212529"/>
+        </w:rPr>
+        <w:t xml:space="preserve"> получал JavaScript-ошибку при каждом запросе. При этом в Main.java включена настройка:</w:t>
+      </w:r>
+    </w:p>
+    <w:p>
+      <w:pPr>
+        <w:shd w:val="clear" w:color="auto" w:fill="FFFFFF"/>
+        <w:spacing w:before="100" w:beforeAutospacing="1" w:after="100" w:afterAutospacing="1" w:line="240" w:lineRule="auto"/>
+        <w:rPr>
+          <w:rFonts w:cs="Segoe UI"/>
+          <w:color w:val="212529"/>
+        </w:rPr>
+      </w:pPr>
+      <w:proofErr w:type="spellStart"/>
+      <w:r>
+        <w:rPr>
+          <w:rFonts w:cs="Segoe UI"/>
+          <w:color w:val="212529"/>
+        </w:rPr>
+        <w:t>HttpUnitOptions.setExceptionsThrownOnScriptError</w:t>
+      </w:r>
+      <w:proofErr w:type="spellEnd"/>
+      <w:r>
+        <w:rPr>
+          <w:rFonts w:cs="Segoe UI"/>
+          <w:color w:val="212529"/>
+        </w:rPr>
+        <w:t>(</w:t>
+      </w:r>
+      <w:proofErr w:type="spellStart"/>
+      <w:r>
+        <w:rPr>
+          <w:rFonts w:cs="Segoe UI"/>
+          <w:color w:val="212529"/>
+        </w:rPr>
+        <w:t>false</w:t>
+      </w:r>
+      <w:proofErr w:type="spellEnd"/>
+      <w:r>
+        <w:rPr>
+          <w:rFonts w:cs="Segoe UI"/>
+          <w:color w:val="212529"/>
+        </w:rPr>
+        <w:t>);</w:t>
+      </w:r>
+    </w:p>
+    <w:p>
+      <w:pPr>
+        <w:shd w:val="clear" w:color="auto" w:fill="FFFFFF"/>
+        <w:spacing w:before="100" w:beforeAutospacing="1" w:after="100" w:afterAutospacing="1" w:line="240" w:lineRule="auto"/>
+        <w:rPr>
+          <w:rFonts w:cs="Segoe UI"/>
+          <w:color w:val="212529"/>
+        </w:rPr>
+      </w:pPr>
+      <w:r>
+        <w:rPr>
+          <w:rFonts w:cs="Segoe UI"/>
+          <w:color w:val="212529"/>
+        </w:rPr>
+        <w:t xml:space="preserve">Из-за нее программа не завершалась с исключением, а </w:t>
+      </w:r>
+      <w:proofErr w:type="spellStart"/>
+      <w:r>
+        <w:rPr>
+          <w:rFonts w:cs="Segoe UI"/>
+          <w:color w:val="212529"/>
+        </w:rPr>
+        <w:t>HttpUnit</w:t>
+      </w:r>
+      <w:proofErr w:type="spellEnd"/>
+      <w:r>
+        <w:rPr>
+          <w:rFonts w:cs="Segoe UI"/>
+          <w:color w:val="212529"/>
+        </w:rPr>
+        <w:t xml:space="preserve"> сохранял сообщения об ошибках во внутреннем списке.</w:t>
+      </w:r>
+    </w:p>
+    <w:p>
+      <w:pPr>
+        <w:shd w:val="clear" w:color="auto" w:fill="FFFFFF"/>
+        <w:spacing w:before="100" w:beforeAutospacing="1" w:after="100" w:afterAutospacing="1" w:line="240" w:lineRule="auto"/>
+        <w:rPr>
+          <w:rFonts w:cs="Segoe UI"/>
+          <w:color w:val="212529"/>
+        </w:rPr>
+      </w:pPr>
+      <w:r>
+        <w:rPr>
+          <w:rFonts w:cs="Segoe UI"/>
+          <w:color w:val="212529"/>
+        </w:rPr>
+        <w:t xml:space="preserve">Гипотеза подтвердилась через Heap </w:t>
+      </w:r>
+      <w:proofErr w:type="spellStart"/>
+      <w:r>
+        <w:rPr>
+          <w:rFonts w:cs="Segoe UI"/>
+          <w:color w:val="212529"/>
+        </w:rPr>
+        <w:t>Dump</w:t>
+      </w:r>
+      <w:proofErr w:type="spellEnd"/>
+      <w:r>
+        <w:rPr>
+          <w:rFonts w:cs="Segoe UI"/>
+          <w:color w:val="212529"/>
+        </w:rPr>
+        <w:t>: среди объектов </w:t>
+      </w:r>
+      <w:proofErr w:type="spellStart"/>
+      <w:proofErr w:type="gramStart"/>
+      <w:r>
+        <w:rPr>
+          <w:rFonts w:cs="Segoe UI"/>
+          <w:color w:val="212529"/>
+        </w:rPr>
+        <w:t>java.lang</w:t>
+      </w:r>
+      <w:proofErr w:type="gramEnd"/>
+      <w:r>
+        <w:rPr>
+          <w:rFonts w:cs="Segoe UI"/>
+          <w:color w:val="212529"/>
+        </w:rPr>
+        <w:t>.String</w:t>
+      </w:r>
+      <w:proofErr w:type="spellEnd"/>
+      <w:r>
+        <w:rPr>
+          <w:rFonts w:cs="Segoe UI"/>
+          <w:color w:val="212529"/>
+        </w:rPr>
+        <w:t> было найдено много одинаковых строк вида:</w:t>
+      </w:r>
+    </w:p>
+    <w:p>
+      <w:pPr>
+        <w:shd w:val="clear" w:color="auto" w:fill="FFFFFF"/>
+        <w:spacing w:before="100" w:beforeAutospacing="1" w:after="100" w:afterAutospacing="1" w:line="240" w:lineRule="auto"/>
+        <w:rPr>
+          <w:rFonts w:cs="Segoe UI"/>
+          <w:color w:val="212529"/>
           <w:lang w:val="en-US"/>
         </w:rPr>
-        <w:t xml:space="preserve">CPU Time </w:t>
-      </w:r>
-      <w:r>
-        <w:rPr>
-          <w:rFonts w:cs="Segoe UI"/>
-          <w:color w:val="212529"/>
-        </w:rPr>
-        <w:t>в</w:t>
-      </w:r>
+      </w:pPr>
       <w:r>
         <w:rPr>
           <w:rFonts w:cs="Segoe UI"/>
           <w:color w:val="212529"/>
           <w:lang w:val="en-US"/>
         </w:rPr>
+        <w:t>Script '</w:t>
+      </w:r>
+      <w:proofErr w:type="spellStart"/>
+      <w:proofErr w:type="gramStart"/>
+      <w:r>
+        <w:rPr>
+          <w:rFonts w:cs="Segoe UI"/>
+          <w:color w:val="212529"/>
+          <w:lang w:val="en-US"/>
+        </w:rPr>
+        <w:t>document.wr</w:t>
+      </w:r>
+      <w:proofErr w:type="spellEnd"/>
+      <w:proofErr w:type="gramEnd"/>
+      <w:r>
+        <w:rPr>
+          <w:rFonts w:cs="Segoe UI"/>
+          <w:color w:val="212529"/>
+          <w:lang w:val="en-US"/>
+        </w:rPr>
+        <w:t xml:space="preserve">(...)' failed: </w:t>
+      </w:r>
+      <w:proofErr w:type="spellStart"/>
+      <w:r>
+        <w:rPr>
+          <w:rFonts w:cs="Segoe UI"/>
+          <w:color w:val="212529"/>
+          <w:lang w:val="en-US"/>
+        </w:rPr>
+        <w:t>TypeError</w:t>
+      </w:r>
+      <w:proofErr w:type="spellEnd"/>
+      <w:r>
+        <w:rPr>
+          <w:rFonts w:cs="Segoe UI"/>
+          <w:color w:val="212529"/>
+          <w:lang w:val="en-US"/>
+        </w:rPr>
+        <w:t xml:space="preserve"> ...</w:t>
+      </w:r>
+    </w:p>
+    <w:p>
+      <w:pPr>
+        <w:shd w:val="clear" w:color="auto" w:fill="FFFFFF"/>
+        <w:spacing w:before="100" w:beforeAutospacing="1" w:after="100" w:afterAutospacing="1" w:line="240" w:lineRule="auto"/>
+        <w:rPr>
+          <w:rFonts w:cs="Segoe UI"/>
+          <w:color w:val="212529"/>
+        </w:rPr>
+      </w:pPr>
+      <w:r>
+        <w:rPr>
+          <w:rFonts w:cs="Segoe UI"/>
+          <w:color w:val="212529"/>
+        </w:rPr>
+        <w:t>В </w:t>
+      </w:r>
+      <w:proofErr w:type="spellStart"/>
+      <w:r>
+        <w:rPr>
+          <w:rFonts w:cs="Segoe UI"/>
+          <w:color w:val="212529"/>
+        </w:rPr>
+        <w:t>References</w:t>
+      </w:r>
+      <w:proofErr w:type="spellEnd"/>
+      <w:r>
+        <w:rPr>
+          <w:rFonts w:cs="Segoe UI"/>
+          <w:color w:val="212529"/>
+        </w:rPr>
+        <w:t> было видно, что эти строки удерживаются через </w:t>
+      </w:r>
+      <w:proofErr w:type="spellStart"/>
+      <w:proofErr w:type="gramStart"/>
+      <w:r>
+        <w:rPr>
+          <w:rFonts w:cs="Segoe UI"/>
+          <w:color w:val="212529"/>
+        </w:rPr>
+        <w:t>java.util</w:t>
+      </w:r>
+      <w:proofErr w:type="gramEnd"/>
+      <w:r>
+        <w:rPr>
+          <w:rFonts w:cs="Segoe UI"/>
+          <w:color w:val="212529"/>
+        </w:rPr>
+        <w:t>.ArrayList.elementData</w:t>
+      </w:r>
+      <w:proofErr w:type="spellEnd"/>
+      <w:r>
+        <w:rPr>
+          <w:rFonts w:cs="Segoe UI"/>
+          <w:color w:val="212529"/>
+        </w:rPr>
+        <w:t>, а сам список находится в статическом поле:</w:t>
+      </w:r>
+    </w:p>
+    <w:p>
+      <w:pPr>
+        <w:shd w:val="clear" w:color="auto" w:fill="FFFFFF"/>
+        <w:spacing w:before="100" w:beforeAutospacing="1" w:after="100" w:afterAutospacing="1" w:line="240" w:lineRule="auto"/>
+        <w:rPr>
+          <w:rFonts w:cs="Segoe UI"/>
+          <w:color w:val="212529"/>
+        </w:rPr>
+      </w:pPr>
+      <w:proofErr w:type="gramStart"/>
+      <w:r>
+        <w:rPr>
+          <w:rFonts w:cs="Segoe UI"/>
+          <w:color w:val="212529"/>
+        </w:rPr>
+        <w:t>com.meterware</w:t>
+      </w:r>
+      <w:proofErr w:type="gramEnd"/>
+      <w:r>
+        <w:rPr>
+          <w:rFonts w:cs="Segoe UI"/>
+          <w:color w:val="212529"/>
+        </w:rPr>
+        <w:t>.</w:t>
+      </w:r>
+      <w:proofErr w:type="gramStart"/>
+      <w:r>
+        <w:rPr>
+          <w:rFonts w:cs="Segoe UI"/>
+          <w:color w:val="212529"/>
+        </w:rPr>
+        <w:t>httpunit.javascript</w:t>
+      </w:r>
+      <w:proofErr w:type="gramEnd"/>
+      <w:r>
+        <w:rPr>
+          <w:rFonts w:cs="Segoe UI"/>
+          <w:color w:val="212529"/>
+        </w:rPr>
+        <w:t>.</w:t>
+      </w:r>
+      <w:proofErr w:type="gramStart"/>
+      <w:r>
+        <w:rPr>
+          <w:rFonts w:cs="Segoe UI"/>
+          <w:color w:val="212529"/>
+        </w:rPr>
+        <w:t>JavaScript._</w:t>
+      </w:r>
+      <w:proofErr w:type="spellStart"/>
+      <w:proofErr w:type="gramEnd"/>
+      <w:r>
+        <w:rPr>
+          <w:rFonts w:cs="Segoe UI"/>
+          <w:color w:val="212529"/>
+        </w:rPr>
+        <w:t>errorMessages</w:t>
+      </w:r>
+      <w:proofErr w:type="spellEnd"/>
+    </w:p>
+    <w:p>
+      <w:pPr>
+        <w:shd w:val="clear" w:color="auto" w:fill="FFFFFF"/>
+        <w:spacing w:before="100" w:beforeAutospacing="1" w:after="100" w:afterAutospacing="1" w:line="240" w:lineRule="auto"/>
+        <w:rPr>
+          <w:rFonts w:cs="Segoe UI"/>
+          <w:color w:val="212529"/>
+        </w:rPr>
+      </w:pPr>
+    </w:p>
+    <w:p>
+      <w:pPr>
+        <w:shd w:val="clear" w:color="auto" w:fill="FFFFFF"/>
+        <w:spacing w:before="100" w:beforeAutospacing="1" w:after="100" w:afterAutospacing="1" w:line="240" w:lineRule="auto"/>
+        <w:rPr>
+          <w:rFonts w:cs="Segoe UI"/>
+          <w:color w:val="212529"/>
+        </w:rPr>
+      </w:pPr>
+    </w:p>
+    <w:p>
+      <w:pPr>
+        <w:shd w:val="clear" w:color="auto" w:fill="FFFFFF"/>
+        <w:spacing w:before="100" w:beforeAutospacing="1" w:after="100" w:afterAutospacing="1" w:line="240" w:lineRule="auto"/>
+        <w:rPr>
+          <w:rFonts w:cs="Segoe UI"/>
+          <w:color w:val="212529"/>
+        </w:rPr>
+      </w:pPr>
+    </w:p>
+    <w:p>
+      <w:pPr>
+        <w:shd w:val="clear" w:color="auto" w:fill="FFFFFF"/>
+        <w:spacing w:before="100" w:beforeAutospacing="1" w:after="100" w:afterAutospacing="1" w:line="240" w:lineRule="auto"/>
+        <w:rPr>
+          <w:rFonts w:cs="Segoe UI"/>
+          <w:b/>
+          <w:bCs/>
+          <w:color w:val="212529"/>
+          <w:sz w:val="32"/>
+          <w:szCs w:val="32"/>
+        </w:rPr>
+      </w:pPr>
+      <w:r>
+        <w:rPr>
+          <w:rFonts w:cs="Segoe UI"/>
+          <w:b/>
+          <w:bCs/>
+          <w:color w:val="212529"/>
+          <w:sz w:val="32"/>
+          <w:szCs w:val="32"/>
+        </w:rPr>
+        <w:lastRenderedPageBreak/>
+        <w:t>Исправление</w:t>
+      </w:r>
+      <w:r>
+        <w:rPr>
+          <w:rFonts w:cs="Segoe UI"/>
+          <w:b/>
+          <w:bCs/>
+          <w:color w:val="212529"/>
+          <w:sz w:val="32"/>
+          <w:szCs w:val="32"/>
+        </w:rPr>
+        <w:t>:</w:t>
+      </w:r>
+    </w:p>
+    <w:p>
+      <w:pPr>
+        <w:shd w:val="clear" w:color="auto" w:fill="FFFFFF"/>
+        <w:spacing w:before="100" w:beforeAutospacing="1" w:after="100" w:afterAutospacing="1" w:line="240" w:lineRule="auto"/>
+        <w:rPr>
+          <w:rFonts w:cs="Segoe UI"/>
+          <w:color w:val="212529"/>
+        </w:rPr>
+      </w:pPr>
+      <w:r>
+        <w:rPr>
+          <w:rFonts w:cs="Segoe UI"/>
+          <w:color w:val="212529"/>
+        </w:rPr>
+        <w:t xml:space="preserve">Исправление было выполнено без изменения </w:t>
+      </w:r>
+      <w:proofErr w:type="spellStart"/>
+      <w:r>
+        <w:rPr>
+          <w:rFonts w:cs="Segoe UI"/>
+          <w:color w:val="212529"/>
+        </w:rPr>
+        <w:t>сервлета</w:t>
+      </w:r>
+      <w:proofErr w:type="spellEnd"/>
+      <w:r>
+        <w:rPr>
+          <w:rFonts w:cs="Segoe UI"/>
+          <w:color w:val="212529"/>
+        </w:rPr>
+        <w:t xml:space="preserve"> и без модификации исходного кода библиотеки </w:t>
+      </w:r>
+      <w:proofErr w:type="spellStart"/>
+      <w:r>
+        <w:rPr>
+          <w:rFonts w:cs="Segoe UI"/>
+          <w:color w:val="212529"/>
+        </w:rPr>
+        <w:t>HttpUnit</w:t>
+      </w:r>
+      <w:proofErr w:type="spellEnd"/>
+      <w:r>
+        <w:rPr>
+          <w:rFonts w:cs="Segoe UI"/>
+          <w:color w:val="212529"/>
+        </w:rPr>
+        <w:t xml:space="preserve">. Для этого использован штатный API </w:t>
+      </w:r>
+      <w:proofErr w:type="spellStart"/>
+      <w:r>
+        <w:rPr>
+          <w:rFonts w:cs="Segoe UI"/>
+          <w:color w:val="212529"/>
+        </w:rPr>
+        <w:t>HttpUnit</w:t>
+      </w:r>
+      <w:proofErr w:type="spellEnd"/>
+      <w:r>
+        <w:rPr>
+          <w:rFonts w:cs="Segoe UI"/>
+          <w:color w:val="212529"/>
+        </w:rPr>
+        <w:t>, который позволяет получить и очистить накопленные сообщения JavaScript-ошибок.</w:t>
+      </w:r>
+    </w:p>
+    <w:p>
+      <w:pPr>
+        <w:shd w:val="clear" w:color="auto" w:fill="FFFFFF"/>
+        <w:spacing w:before="100" w:beforeAutospacing="1" w:after="100" w:afterAutospacing="1" w:line="240" w:lineRule="auto"/>
+        <w:rPr>
+          <w:rFonts w:cs="Segoe UI"/>
+          <w:color w:val="212529"/>
+        </w:rPr>
+      </w:pPr>
+      <w:r>
+        <w:rPr>
+          <w:rFonts w:cs="Segoe UI"/>
+          <w:color w:val="212529"/>
+        </w:rPr>
+        <w:t>В основной цикл программы добавлено ограничение на количество хранимых ошибок:</w:t>
+      </w:r>
+    </w:p>
+    <w:p>
+      <w:pPr>
+        <w:shd w:val="clear" w:color="auto" w:fill="FFFFFF"/>
+        <w:spacing w:before="100" w:beforeAutospacing="1" w:after="100" w:afterAutospacing="1" w:line="240" w:lineRule="auto"/>
+        <w:rPr>
+          <w:rFonts w:cs="Segoe UI"/>
+          <w:color w:val="212529"/>
+        </w:rPr>
+      </w:pPr>
+      <w:proofErr w:type="spellStart"/>
+      <w:r>
+        <w:rPr>
+          <w:rFonts w:cs="Segoe UI"/>
+          <w:color w:val="212529"/>
+        </w:rPr>
+        <w:t>final</w:t>
+      </w:r>
+      <w:proofErr w:type="spellEnd"/>
+      <w:r>
+        <w:rPr>
+          <w:rFonts w:cs="Segoe UI"/>
+          <w:color w:val="212529"/>
+        </w:rPr>
         <w:t xml:space="preserve"> </w:t>
       </w:r>
-      <w:r>
+      <w:proofErr w:type="spellStart"/>
+      <w:r>
+        <w:rPr>
+          <w:rFonts w:cs="Segoe UI"/>
+          <w:color w:val="212529"/>
+        </w:rPr>
+        <w:t>int</w:t>
+      </w:r>
+      <w:proofErr w:type="spellEnd"/>
+      <w:r>
+        <w:rPr>
+          <w:rFonts w:cs="Segoe UI"/>
+          <w:color w:val="212529"/>
+        </w:rPr>
+        <w:t xml:space="preserve"> </w:t>
+      </w:r>
+      <w:proofErr w:type="spellStart"/>
+      <w:r>
+        <w:rPr>
+          <w:rFonts w:cs="Segoe UI"/>
+          <w:color w:val="212529"/>
+        </w:rPr>
+        <w:t>maxStoredScriptErrors</w:t>
+      </w:r>
+      <w:proofErr w:type="spellEnd"/>
+      <w:r>
+        <w:rPr>
+          <w:rFonts w:cs="Segoe UI"/>
+          <w:color w:val="212529"/>
+        </w:rPr>
+        <w:t xml:space="preserve"> = 50;</w:t>
+      </w:r>
+    </w:p>
+    <w:p>
+      <w:pPr>
+        <w:shd w:val="clear" w:color="auto" w:fill="FFFFFF"/>
+        <w:spacing w:before="100" w:beforeAutospacing="1" w:after="100" w:afterAutospacing="1" w:line="240" w:lineRule="auto"/>
+        <w:rPr>
+          <w:rFonts w:cs="Segoe UI"/>
+          <w:color w:val="212529"/>
+        </w:rPr>
+      </w:pPr>
+      <w:r>
+        <w:rPr>
+          <w:rFonts w:cs="Segoe UI"/>
+          <w:color w:val="212529"/>
+        </w:rPr>
+        <w:t xml:space="preserve">После каждого запроса программа проверяет, сколько сообщений уже накоплено во внутреннем списке </w:t>
+      </w:r>
+      <w:proofErr w:type="spellStart"/>
+      <w:r>
+        <w:rPr>
+          <w:rFonts w:cs="Segoe UI"/>
+          <w:color w:val="212529"/>
+        </w:rPr>
+        <w:t>HttpUnit</w:t>
+      </w:r>
+      <w:proofErr w:type="spellEnd"/>
+      <w:r>
+        <w:rPr>
+          <w:rFonts w:cs="Segoe UI"/>
+          <w:color w:val="212529"/>
+        </w:rPr>
+        <w:t>:</w:t>
+      </w:r>
+    </w:p>
+    <w:p>
+      <w:pPr>
+        <w:shd w:val="clear" w:color="auto" w:fill="FFFFFF"/>
+        <w:spacing w:before="100" w:beforeAutospacing="1" w:after="100" w:afterAutospacing="1" w:line="240" w:lineRule="auto"/>
         <w:rPr>
           <w:rFonts w:cs="Segoe UI"/>
           <w:color w:val="212529"/>
           <w:lang w:val="en-US"/>
         </w:rPr>
-        <w:t>IntelliJ Idea</w:t>
-      </w:r>
+      </w:pPr>
+      <w:r>
+        <w:rPr>
+          <w:rFonts w:cs="Segoe UI"/>
+          <w:color w:val="212529"/>
+          <w:lang w:val="en-US"/>
+        </w:rPr>
+        <w:t>if (</w:t>
+      </w:r>
+      <w:proofErr w:type="spellStart"/>
+      <w:r>
+        <w:rPr>
+          <w:rFonts w:cs="Segoe UI"/>
+          <w:color w:val="212529"/>
+          <w:lang w:val="en-US"/>
+        </w:rPr>
+        <w:t>HttpUnitOptions.getScriptErrorMessages</w:t>
+      </w:r>
+      <w:proofErr w:type="spellEnd"/>
+      <w:r>
+        <w:rPr>
+          <w:rFonts w:cs="Segoe UI"/>
+          <w:color w:val="212529"/>
+          <w:lang w:val="en-US"/>
+        </w:rPr>
+        <w:t>(</w:t>
+      </w:r>
+      <w:proofErr w:type="gramStart"/>
+      <w:r>
+        <w:rPr>
+          <w:rFonts w:cs="Segoe UI"/>
+          <w:color w:val="212529"/>
+          <w:lang w:val="en-US"/>
+        </w:rPr>
+        <w:t>).length</w:t>
+      </w:r>
+      <w:proofErr w:type="gramEnd"/>
+      <w:r>
+        <w:rPr>
+          <w:rFonts w:cs="Segoe UI"/>
+          <w:color w:val="212529"/>
+          <w:lang w:val="en-US"/>
+        </w:rPr>
+        <w:t xml:space="preserve"> &gt;= </w:t>
+      </w:r>
+      <w:proofErr w:type="spellStart"/>
+      <w:r>
+        <w:rPr>
+          <w:rFonts w:cs="Segoe UI"/>
+          <w:color w:val="212529"/>
+          <w:lang w:val="en-US"/>
+        </w:rPr>
+        <w:t>maxStoredScriptErrors</w:t>
+      </w:r>
+      <w:proofErr w:type="spellEnd"/>
+      <w:r>
+        <w:rPr>
+          <w:rFonts w:cs="Segoe UI"/>
+          <w:color w:val="212529"/>
+          <w:lang w:val="en-US"/>
+        </w:rPr>
+        <w:t>) {</w:t>
+      </w:r>
+    </w:p>
+    <w:p>
+      <w:pPr>
+        <w:shd w:val="clear" w:color="auto" w:fill="FFFFFF"/>
+        <w:spacing w:before="100" w:beforeAutospacing="1" w:after="100" w:afterAutospacing="1" w:line="240" w:lineRule="auto"/>
+        <w:rPr>
+          <w:rFonts w:cs="Segoe UI"/>
+          <w:color w:val="212529"/>
+        </w:rPr>
+      </w:pPr>
+      <w:r>
+        <w:rPr>
+          <w:rFonts w:cs="Segoe UI"/>
+          <w:color w:val="212529"/>
+          <w:lang w:val="en-US"/>
+        </w:rPr>
+        <w:t xml:space="preserve">    </w:t>
+      </w:r>
+      <w:proofErr w:type="spellStart"/>
+      <w:r>
+        <w:rPr>
+          <w:rFonts w:cs="Segoe UI"/>
+          <w:color w:val="212529"/>
+        </w:rPr>
+        <w:t>HttpUnitOptions.clearScriptErrorMessages</w:t>
+      </w:r>
+      <w:proofErr w:type="spellEnd"/>
+      <w:r>
+        <w:rPr>
+          <w:rFonts w:cs="Segoe UI"/>
+          <w:color w:val="212529"/>
+        </w:rPr>
+        <w:t>();</w:t>
+      </w:r>
+    </w:p>
+    <w:p>
+      <w:pPr>
+        <w:shd w:val="clear" w:color="auto" w:fill="FFFFFF"/>
+        <w:spacing w:before="100" w:beforeAutospacing="1" w:after="100" w:afterAutospacing="1" w:line="240" w:lineRule="auto"/>
+        <w:rPr>
+          <w:rFonts w:cs="Segoe UI"/>
+          <w:color w:val="212529"/>
+        </w:rPr>
+      </w:pPr>
+      <w:r>
+        <w:rPr>
+          <w:rFonts w:cs="Segoe UI"/>
+          <w:color w:val="212529"/>
+        </w:rPr>
+        <w:t>}</w:t>
+      </w:r>
+    </w:p>
+    <w:p>
+      <w:pPr>
+        <w:shd w:val="clear" w:color="auto" w:fill="FFFFFF"/>
+        <w:spacing w:before="100" w:beforeAutospacing="1" w:after="100" w:afterAutospacing="1" w:line="240" w:lineRule="auto"/>
+        <w:rPr>
+          <w:rFonts w:cs="Segoe UI"/>
+          <w:color w:val="212529"/>
+        </w:rPr>
+      </w:pPr>
+      <w:r>
+        <w:rPr>
+          <w:rFonts w:cs="Segoe UI"/>
+          <w:color w:val="212529"/>
+        </w:rPr>
+        <w:t>Если количество сообщений достигает 50, вызывается:</w:t>
+      </w:r>
+    </w:p>
+    <w:p>
+      <w:pPr>
+        <w:shd w:val="clear" w:color="auto" w:fill="FFFFFF"/>
+        <w:spacing w:before="100" w:beforeAutospacing="1" w:after="100" w:afterAutospacing="1" w:line="240" w:lineRule="auto"/>
+        <w:rPr>
+          <w:rFonts w:cs="Segoe UI"/>
+          <w:color w:val="212529"/>
+        </w:rPr>
+      </w:pPr>
+      <w:proofErr w:type="spellStart"/>
+      <w:r>
+        <w:rPr>
+          <w:rFonts w:cs="Segoe UI"/>
+          <w:color w:val="212529"/>
+        </w:rPr>
+        <w:t>HttpUnitOptions.clearScriptErrorMessages</w:t>
+      </w:r>
+      <w:proofErr w:type="spellEnd"/>
+      <w:r>
+        <w:rPr>
+          <w:rFonts w:cs="Segoe UI"/>
+          <w:color w:val="212529"/>
+        </w:rPr>
+        <w:t>();</w:t>
+      </w:r>
+    </w:p>
+    <w:p>
+      <w:pPr>
+        <w:shd w:val="clear" w:color="auto" w:fill="FFFFFF"/>
+        <w:spacing w:before="100" w:beforeAutospacing="1" w:after="100" w:afterAutospacing="1" w:line="240" w:lineRule="auto"/>
+        <w:rPr>
+          <w:rFonts w:cs="Segoe UI"/>
+          <w:color w:val="212529"/>
+        </w:rPr>
+      </w:pPr>
+      <w:r>
+        <w:rPr>
+          <w:rFonts w:cs="Segoe UI"/>
+          <w:color w:val="212529"/>
+        </w:rPr>
+        <w:t xml:space="preserve">Этот метод очищает внутренний список ошибок </w:t>
+      </w:r>
+      <w:proofErr w:type="spellStart"/>
+      <w:r>
+        <w:rPr>
+          <w:rFonts w:cs="Segoe UI"/>
+          <w:color w:val="212529"/>
+        </w:rPr>
+        <w:t>HttpUnit</w:t>
+      </w:r>
+      <w:proofErr w:type="spellEnd"/>
+      <w:r>
+        <w:rPr>
+          <w:rFonts w:cs="Segoe UI"/>
+          <w:color w:val="212529"/>
+        </w:rPr>
+        <w:t>. За счет этого сообщения о повторяющейся JavaScript-ошибке больше не могут накапливаться бесконечно.</w:t>
+      </w:r>
+    </w:p>
+    <w:p>
+      <w:pPr>
+        <w:shd w:val="clear" w:color="auto" w:fill="FFFFFF"/>
+        <w:spacing w:before="100" w:beforeAutospacing="1" w:after="100" w:afterAutospacing="1" w:line="240" w:lineRule="auto"/>
+        <w:rPr>
+          <w:rFonts w:cs="Segoe UI"/>
+          <w:color w:val="212529"/>
+        </w:rPr>
+      </w:pPr>
+      <w:r>
+        <w:rPr>
+          <w:rFonts w:cs="Segoe UI"/>
+          <w:color w:val="212529"/>
+        </w:rPr>
+        <w:t xml:space="preserve">После исправления программа по-прежнему воспроизводит исходный сценарий: </w:t>
+      </w:r>
+      <w:proofErr w:type="spellStart"/>
+      <w:r>
+        <w:rPr>
+          <w:rFonts w:cs="Segoe UI"/>
+          <w:color w:val="212529"/>
+        </w:rPr>
+        <w:t>сервлет</w:t>
+      </w:r>
+      <w:proofErr w:type="spellEnd"/>
+      <w:r>
+        <w:rPr>
+          <w:rFonts w:cs="Segoe UI"/>
+          <w:color w:val="212529"/>
+        </w:rPr>
+        <w:t xml:space="preserve"> возвращает тот же HTML с ошибочным JavaScript, а </w:t>
+      </w:r>
+      <w:proofErr w:type="spellStart"/>
+      <w:r>
+        <w:rPr>
+          <w:rFonts w:cs="Segoe UI"/>
+          <w:color w:val="212529"/>
+        </w:rPr>
+        <w:t>HttpUnit</w:t>
+      </w:r>
+      <w:proofErr w:type="spellEnd"/>
+      <w:r>
+        <w:rPr>
+          <w:rFonts w:cs="Segoe UI"/>
+          <w:color w:val="212529"/>
+        </w:rPr>
+        <w:t xml:space="preserve"> продолжает обрабатывать ответ. Однако количество сохраненных сообщений об ошибках теперь ограничено. </w:t>
+      </w:r>
+    </w:p>
+    <w:p>
+      <w:pPr>
+        <w:shd w:val="clear" w:color="auto" w:fill="FFFFFF"/>
+        <w:spacing w:before="100" w:beforeAutospacing="1" w:after="100" w:afterAutospacing="1" w:line="240" w:lineRule="auto"/>
+        <w:rPr>
+          <w:rFonts w:cs="Segoe UI"/>
+          <w:color w:val="212529"/>
+        </w:rPr>
+      </w:pPr>
+      <w:r>
+        <w:rPr>
+          <w:rFonts w:cs="Segoe UI"/>
+          <w:color w:val="212529"/>
+        </w:rPr>
+        <w:t xml:space="preserve">Также, чтобы ограничить рост классов и </w:t>
+      </w:r>
+      <w:r>
+        <w:rPr>
+          <w:rFonts w:cs="Segoe UI"/>
+          <w:color w:val="212529"/>
+          <w:lang w:val="en-US"/>
+        </w:rPr>
+        <w:t>Heap</w:t>
+      </w:r>
+      <w:r>
+        <w:rPr>
+          <w:rFonts w:cs="Segoe UI"/>
+          <w:color w:val="212529"/>
+        </w:rPr>
+        <w:t xml:space="preserve">, был использован флаг </w:t>
+      </w:r>
+      <w:r>
+        <w:rPr>
+          <w:rFonts w:cs="Segoe UI"/>
+          <w:color w:val="212529"/>
+        </w:rPr>
+        <w:t>-</w:t>
+      </w:r>
+      <w:proofErr w:type="spellStart"/>
+      <w:r>
+        <w:rPr>
+          <w:rFonts w:cs="Segoe UI"/>
+          <w:color w:val="212529"/>
+          <w:lang w:val="en-US"/>
+        </w:rPr>
+        <w:t>Xmx</w:t>
+      </w:r>
+      <w:proofErr w:type="spellEnd"/>
+      <w:r>
+        <w:rPr>
+          <w:rFonts w:cs="Segoe UI"/>
+          <w:color w:val="212529"/>
+        </w:rPr>
+        <w:t>29</w:t>
+      </w:r>
+      <w:r>
+        <w:rPr>
+          <w:rFonts w:cs="Segoe UI"/>
+          <w:color w:val="212529"/>
+          <w:lang w:val="en-US"/>
+        </w:rPr>
+        <w:t>m</w:t>
+      </w:r>
+      <w:r>
+        <w:rPr>
+          <w:rFonts w:cs="Segoe UI"/>
+          <w:color w:val="212529"/>
+        </w:rPr>
+        <w:t>, ограничивающий размер кучи сверху до 29мб.</w:t>
+      </w:r>
+    </w:p>
+    <w:p>
+      <w:pPr>
+        <w:shd w:val="clear" w:color="auto" w:fill="FFFFFF"/>
+        <w:spacing w:before="100" w:beforeAutospacing="1" w:after="100" w:afterAutospacing="1" w:line="240" w:lineRule="auto"/>
+        <w:rPr>
+          <w:rFonts w:cs="Segoe UI"/>
+          <w:color w:val="212529"/>
+        </w:rPr>
+      </w:pPr>
     </w:p>
     <w:p>
       <w:pPr>
@@ -4392,11 +4946,12 @@
           <w:rFonts w:cs="Segoe UI"/>
           <w:color w:val="212529"/>
         </w:rPr>
+        <w:lastRenderedPageBreak/>
         <w:drawing>
-          <wp:inline distT="0" distB="0" distL="0" distR="0" wp14:anchorId="5497B13A" wp14:editId="2BCBDD05">
-            <wp:extent cx="5940425" cy="2360295"/>
-            <wp:effectExtent l="0" t="0" r="3175" b="1905"/>
-            <wp:docPr id="381348253" name="Рисунок 1"/>
+          <wp:inline distT="0" distB="0" distL="0" distR="0" wp14:anchorId="3BB3D9E2" wp14:editId="00EBE1B8">
+            <wp:extent cx="5940425" cy="4352925"/>
+            <wp:effectExtent l="0" t="0" r="3175" b="3175"/>
+            <wp:docPr id="1753261279" name="Рисунок 1"/>
             <wp:cNvGraphicFramePr>
               <a:graphicFrameLocks xmlns:a="http://schemas.openxmlformats.org/drawingml/2006/main" noChangeAspect="1"/>
             </wp:cNvGraphicFramePr>
@@ -4404,7 +4959,7 @@
               <a:graphicData uri="http://schemas.openxmlformats.org/drawingml/2006/picture">
                 <pic:pic xmlns:pic="http://schemas.openxmlformats.org/drawingml/2006/picture">
                   <pic:nvPicPr>
-                    <pic:cNvPr id="381348253" name=""/>
+                    <pic:cNvPr id="1753261279" name=""/>
                     <pic:cNvPicPr/>
                   </pic:nvPicPr>
                   <pic:blipFill>
@@ -4416,7 +4971,7 @@
                   <pic:spPr>
                     <a:xfrm>
                       <a:off x="0" y="0"/>
-                      <a:ext cx="5940425" cy="2360295"/>
+                      <a:ext cx="5940425" cy="4352925"/>
                     </a:xfrm>
                     <a:prstGeom prst="rect">
                       <a:avLst/>
@@ -4437,15 +4992,36 @@
         <w:rPr>
           <w:rFonts w:cs="Segoe UI"/>
           <w:color w:val="212529"/>
+        </w:rPr>
+      </w:pPr>
+      <w:r>
+        <w:rPr>
+          <w:rFonts w:cs="Segoe UI"/>
+          <w:color w:val="212529"/>
+        </w:rPr>
+        <w:t>Рис</w:t>
+      </w:r>
+      <w:r>
+        <w:rPr>
+          <w:rFonts w:cs="Segoe UI"/>
+          <w:color w:val="212529"/>
           <w:lang w:val="en-US"/>
         </w:rPr>
-      </w:pPr>
-      <w:r>
-        <w:rPr>
-          <w:rFonts w:cs="Segoe UI"/>
-          <w:color w:val="212529"/>
-        </w:rPr>
-        <w:t>Рис</w:t>
+        <w:t>. 4.</w:t>
+      </w:r>
+      <w:r>
+        <w:rPr>
+          <w:rFonts w:cs="Segoe UI"/>
+          <w:color w:val="212529"/>
+        </w:rPr>
+        <w:t>5</w:t>
+      </w:r>
+      <w:r>
+        <w:rPr>
+          <w:rFonts w:cs="Segoe UI"/>
+          <w:color w:val="212529"/>
+        </w:rPr>
+        <w:t xml:space="preserve"> </w:t>
       </w:r>
       <w:r>
         <w:rPr>
@@ -4453,77 +5029,28 @@
           <w:color w:val="212529"/>
           <w:lang w:val="en-US"/>
         </w:rPr>
-        <w:t>. 4.</w:t>
-      </w:r>
-      <w:r>
-        <w:rPr>
-          <w:rFonts w:cs="Segoe UI"/>
-          <w:color w:val="212529"/>
-          <w:lang w:val="en-US"/>
-        </w:rPr>
-        <w:t>5</w:t>
-      </w:r>
-      <w:r>
-        <w:rPr>
-          <w:rFonts w:cs="Segoe UI"/>
-          <w:color w:val="212529"/>
-          <w:lang w:val="en-US"/>
-        </w:rPr>
-        <w:t xml:space="preserve"> – </w:t>
-      </w:r>
-      <w:r>
-        <w:rPr>
-          <w:rFonts w:cs="Segoe UI"/>
-          <w:color w:val="212529"/>
-          <w:lang w:val="en-US"/>
-        </w:rPr>
-        <w:t xml:space="preserve">Call Tree </w:t>
-      </w:r>
-      <w:r>
-        <w:rPr>
-          <w:rFonts w:cs="Segoe UI"/>
-          <w:color w:val="212529"/>
-        </w:rPr>
-        <w:t>по</w:t>
-      </w:r>
-      <w:r>
-        <w:rPr>
-          <w:rFonts w:cs="Segoe UI"/>
-          <w:color w:val="212529"/>
-          <w:lang w:val="en-US"/>
-        </w:rPr>
-        <w:t xml:space="preserve"> </w:t>
-      </w:r>
-      <w:r>
-        <w:rPr>
-          <w:rFonts w:cs="Segoe UI"/>
-          <w:color w:val="212529"/>
-          <w:lang w:val="en-US"/>
-        </w:rPr>
-        <w:t xml:space="preserve">Memory Allocations </w:t>
-      </w:r>
-      <w:r>
-        <w:rPr>
-          <w:rFonts w:cs="Segoe UI"/>
-          <w:color w:val="212529"/>
-        </w:rPr>
-        <w:t>в</w:t>
-      </w:r>
-      <w:r>
-        <w:rPr>
-          <w:rFonts w:cs="Segoe UI"/>
-          <w:color w:val="212529"/>
-          <w:lang w:val="en-US"/>
-        </w:rPr>
-        <w:t xml:space="preserve"> </w:t>
-      </w:r>
-      <w:r>
-        <w:rPr>
-          <w:rFonts w:cs="Segoe UI"/>
-          <w:color w:val="212529"/>
-          <w:lang w:val="en-US"/>
-        </w:rPr>
-        <w:t>IntelliJ Idea</w:t>
+        <w:t xml:space="preserve">– </w:t>
+      </w:r>
+      <w:r>
+        <w:rPr>
+          <w:rFonts w:cs="Segoe UI"/>
+          <w:color w:val="212529"/>
+        </w:rPr>
+        <w:t xml:space="preserve">показатели </w:t>
+      </w:r>
+      <w:r>
+        <w:rPr>
+          <w:rFonts w:cs="Segoe UI"/>
+          <w:color w:val="212529"/>
+        </w:rPr>
+        <w:t>после</w:t>
+      </w:r>
+      <w:r>
+        <w:rPr>
+          <w:rFonts w:cs="Segoe UI"/>
+          <w:color w:val="212529"/>
+        </w:rPr>
+        <w:t xml:space="preserve"> исправления</w:t>
       </w:r>
     </w:p>
     <w:p>
@@ -4534,33 +5061,18 @@
         <w:rPr>
           <w:rFonts w:cs="Segoe UI"/>
           <w:color w:val="212529"/>
-          <w:lang w:val="en-US"/>
-        </w:rPr>
-      </w:pPr>
-    </w:p>
-    <w:p>
-      <w:pPr>
-        <w:shd w:val="clear" w:color="auto" w:fill="FFFFFF"/>
-        <w:spacing w:before="100" w:beforeAutospacing="1" w:after="100" w:afterAutospacing="1" w:line="240" w:lineRule="auto"/>
-        <w:jc w:val="center"/>
-        <w:rPr>
-          <w:rFonts w:cs="Segoe UI"/>
-          <w:color w:val="212529"/>
-        </w:rPr>
-      </w:pPr>
-      <w:r>
-        <w:rPr>
-          <w:rFonts w:cs="Segoe UI"/>
-          <w:noProof/>
-          <w:color w:val="212529"/>
-          <w:lang w:val="en-US"/>
-        </w:rPr>
-        <w:lastRenderedPageBreak/>
+        </w:rPr>
+      </w:pPr>
+      <w:r>
+        <w:rPr>
+          <w:rFonts w:cs="Segoe UI"/>
+          <w:color w:val="212529"/>
+        </w:rPr>
         <w:drawing>
-          <wp:inline distT="0" distB="0" distL="0" distR="0" wp14:anchorId="5CEDB1BD" wp14:editId="2997B7E7">
-            <wp:extent cx="5940425" cy="4333240"/>
-            <wp:effectExtent l="0" t="0" r="3175" b="0"/>
-            <wp:docPr id="660912147" name="Рисунок 1"/>
+          <wp:inline distT="0" distB="0" distL="0" distR="0" wp14:anchorId="5B4B81E4" wp14:editId="5EB301C0">
+            <wp:extent cx="5467927" cy="3713865"/>
+            <wp:effectExtent l="0" t="0" r="6350" b="0"/>
+            <wp:docPr id="860260875" name="Рисунок 1"/>
             <wp:cNvGraphicFramePr>
               <a:graphicFrameLocks xmlns:a="http://schemas.openxmlformats.org/drawingml/2006/main" noChangeAspect="1"/>
             </wp:cNvGraphicFramePr>
@@ -4568,7 +5080,7 @@
               <a:graphicData uri="http://schemas.openxmlformats.org/drawingml/2006/picture">
                 <pic:pic xmlns:pic="http://schemas.openxmlformats.org/drawingml/2006/picture">
                   <pic:nvPicPr>
-                    <pic:cNvPr id="660912147" name=""/>
+                    <pic:cNvPr id="860260875" name=""/>
                     <pic:cNvPicPr/>
                   </pic:nvPicPr>
                   <pic:blipFill>
@@ -4580,7 +5092,7 @@
                   <pic:spPr>
                     <a:xfrm>
                       <a:off x="0" y="0"/>
-                      <a:ext cx="5940425" cy="4333240"/>
+                      <a:ext cx="5500860" cy="3736234"/>
                     </a:xfrm>
                     <a:prstGeom prst="rect">
                       <a:avLst/>
@@ -4601,6 +5113,7 @@
         <w:rPr>
           <w:rFonts w:cs="Segoe UI"/>
           <w:color w:val="212529"/>
+          <w:lang w:val="en-US"/>
         </w:rPr>
       </w:pPr>
       <w:r>
@@ -4622,24 +5135,116 @@
           <w:rFonts w:cs="Segoe UI"/>
           <w:color w:val="212529"/>
         </w:rPr>
-        <w:t xml:space="preserve"> – показатели после исправления</w:t>
-      </w:r>
-    </w:p>
-    <w:p>
-      <w:pPr>
-        <w:shd w:val="clear" w:color="auto" w:fill="FFFFFF"/>
-        <w:spacing w:before="100" w:beforeAutospacing="1" w:after="100" w:afterAutospacing="1" w:line="240" w:lineRule="auto"/>
-        <w:rPr>
-          <w:rFonts w:cs="Segoe UI"/>
-          <w:color w:val="212529"/>
-        </w:rPr>
-      </w:pPr>
-      <w:r>
-        <w:rPr>
-          <w:rFonts w:cs="Segoe UI"/>
-          <w:color w:val="212529"/>
-        </w:rPr>
-        <w:t xml:space="preserve">После внесения изменений программа была повторно проверена в VisualVM. На графике </w:t>
+        <w:t xml:space="preserve"> </w:t>
+      </w:r>
+      <w:r>
+        <w:rPr>
+          <w:rFonts w:cs="Segoe UI"/>
+          <w:color w:val="212529"/>
+        </w:rPr>
+        <w:t xml:space="preserve">– </w:t>
+      </w:r>
+      <w:r>
+        <w:rPr>
+          <w:rFonts w:cs="Segoe UI"/>
+          <w:color w:val="212529"/>
+          <w:lang w:val="en-US"/>
+        </w:rPr>
+        <w:t>Heap</w:t>
+      </w:r>
+      <w:r>
+        <w:rPr>
+          <w:rFonts w:cs="Segoe UI"/>
+          <w:color w:val="212529"/>
+        </w:rPr>
+        <w:t xml:space="preserve"> </w:t>
+      </w:r>
+      <w:r>
+        <w:rPr>
+          <w:rFonts w:cs="Segoe UI"/>
+          <w:color w:val="212529"/>
+          <w:lang w:val="en-US"/>
+        </w:rPr>
+        <w:t>Dump</w:t>
+      </w:r>
+      <w:r>
+        <w:rPr>
+          <w:rFonts w:cs="Segoe UI"/>
+          <w:color w:val="212529"/>
+        </w:rPr>
+        <w:t xml:space="preserve"> </w:t>
+      </w:r>
+      <w:r>
+        <w:rPr>
+          <w:rFonts w:cs="Segoe UI"/>
+          <w:color w:val="212529"/>
+        </w:rPr>
+        <w:t>после исправления</w:t>
+      </w:r>
+    </w:p>
+    <w:p>
+      <w:pPr>
+        <w:shd w:val="clear" w:color="auto" w:fill="FFFFFF"/>
+        <w:spacing w:before="100" w:beforeAutospacing="1" w:after="100" w:afterAutospacing="1" w:line="240" w:lineRule="auto"/>
+        <w:rPr>
+          <w:rFonts w:cs="Segoe UI"/>
+          <w:b/>
+          <w:bCs/>
+          <w:color w:val="212529"/>
+          <w:sz w:val="32"/>
+          <w:szCs w:val="32"/>
+        </w:rPr>
+      </w:pPr>
+      <w:r>
+        <w:rPr>
+          <w:rFonts w:cs="Segoe UI"/>
+          <w:b/>
+          <w:bCs/>
+          <w:color w:val="212529"/>
+          <w:sz w:val="32"/>
+          <w:szCs w:val="32"/>
+        </w:rPr>
+        <w:lastRenderedPageBreak/>
+        <w:t>И</w:t>
+      </w:r>
+      <w:r>
+        <w:rPr>
+          <w:rFonts w:cs="Segoe UI"/>
+          <w:b/>
+          <w:bCs/>
+          <w:color w:val="212529"/>
+          <w:sz w:val="32"/>
+          <w:szCs w:val="32"/>
+        </w:rPr>
+        <w:t>тог</w:t>
+      </w:r>
+      <w:r>
+        <w:rPr>
+          <w:rFonts w:cs="Segoe UI"/>
+          <w:b/>
+          <w:bCs/>
+          <w:color w:val="212529"/>
+          <w:sz w:val="32"/>
+          <w:szCs w:val="32"/>
+        </w:rPr>
+        <w:t>:</w:t>
+      </w:r>
+    </w:p>
+    <w:p>
+      <w:pPr>
+        <w:shd w:val="clear" w:color="auto" w:fill="FFFFFF"/>
+        <w:spacing w:before="100" w:beforeAutospacing="1" w:after="100" w:afterAutospacing="1" w:line="240" w:lineRule="auto"/>
+        <w:rPr>
+          <w:rFonts w:cs="Segoe UI"/>
+          <w:color w:val="212529"/>
+        </w:rPr>
+      </w:pPr>
+      <w:r>
+        <w:rPr>
+          <w:rFonts w:cs="Segoe UI"/>
+          <w:color w:val="212529"/>
+        </w:rPr>
+        <w:t xml:space="preserve">После добавления периодической очистки списка JavaScript-ошибок программа была повторно запущена без изменения </w:t>
       </w:r>
       <w:proofErr w:type="spellStart"/>
       <w:r>
@@ -4647,7 +5252,7 @@
           <w:rFonts w:cs="Segoe UI"/>
           <w:color w:val="212529"/>
         </w:rPr>
-        <w:t>Classes</w:t>
+        <w:t>сервлета</w:t>
       </w:r>
       <w:proofErr w:type="spellEnd"/>
       <w:r>
@@ -4655,59 +5260,46 @@
           <w:rFonts w:cs="Segoe UI"/>
           <w:color w:val="212529"/>
         </w:rPr>
-        <w:t xml:space="preserve"> видно, что количество загруженных классов после небольшого роста при старте стабилизировалось примерно на уровне 3147 и дальше почти не увеличивалось. Это главное отличие от состояния до исправления, где число классов постоянно росло. Следовательно, проблема с динамической загрузкой классов была устранена.</w:t>
-      </w:r>
-    </w:p>
-    <w:p>
-      <w:pPr>
-        <w:shd w:val="clear" w:color="auto" w:fill="FFFFFF"/>
-        <w:spacing w:before="100" w:beforeAutospacing="1" w:after="100" w:afterAutospacing="1" w:line="240" w:lineRule="auto"/>
-        <w:rPr>
-          <w:rFonts w:cs="Segoe UI"/>
-          <w:color w:val="212529"/>
-        </w:rPr>
-      </w:pPr>
-      <w:r>
-        <w:rPr>
-          <w:rFonts w:cs="Segoe UI"/>
-          <w:color w:val="212529"/>
-        </w:rPr>
-        <w:t>График Heap показывает постепенный рост используемой памяти, но это связано с созданием временных объектов при обработке запросов и не указывает на прежнюю проблему с загрузкой классов.</w:t>
-      </w:r>
-    </w:p>
-    <w:p>
-      <w:pPr>
-        <w:shd w:val="clear" w:color="auto" w:fill="FFFFFF"/>
-        <w:spacing w:before="100" w:beforeAutospacing="1" w:after="100" w:afterAutospacing="1" w:line="240" w:lineRule="auto"/>
-        <w:rPr>
-          <w:rFonts w:cs="Segoe UI"/>
-          <w:color w:val="212529"/>
-        </w:rPr>
-      </w:pPr>
-      <w:r>
-        <w:rPr>
-          <w:rFonts w:cs="Segoe UI"/>
-          <w:color w:val="212529"/>
-        </w:rPr>
-        <w:t>Повторное профилирование показало, что проблемные методы, связанные с обработкой JavaScript, больше не являются значимыми:</w:t>
-      </w:r>
-    </w:p>
-    <w:p>
-      <w:pPr>
-        <w:shd w:val="clear" w:color="auto" w:fill="FFFFFF"/>
-        <w:spacing w:before="100" w:beforeAutospacing="1" w:after="100" w:afterAutospacing="1" w:line="240" w:lineRule="auto"/>
-        <w:rPr>
-          <w:rFonts w:cs="Segoe UI"/>
-          <w:color w:val="212529"/>
-        </w:rPr>
-      </w:pPr>
+        <w:t xml:space="preserve"> и без исправления самого ошибочного JavaScript. На мониторинге VisualVM видно, что heap-память </w:t>
+      </w:r>
+      <w:r>
+        <w:rPr>
+          <w:rFonts w:cs="Segoe UI"/>
+          <w:color w:val="212529"/>
+        </w:rPr>
+        <w:t>не растет, как и диаграмма загруженных классов.</w:t>
+      </w:r>
+      <w:r>
+        <w:rPr>
+          <w:rFonts w:cs="Segoe UI"/>
+          <w:color w:val="212529"/>
+        </w:rPr>
+        <w:t xml:space="preserve"> </w:t>
+      </w:r>
+    </w:p>
+    <w:p>
+      <w:pPr>
+        <w:shd w:val="clear" w:color="auto" w:fill="FFFFFF"/>
+        <w:spacing w:before="100" w:beforeAutospacing="1" w:after="100" w:afterAutospacing="1" w:line="240" w:lineRule="auto"/>
+        <w:rPr>
+          <w:rFonts w:cs="Segoe UI"/>
+          <w:color w:val="212529"/>
+        </w:rPr>
+      </w:pPr>
+      <w:r>
+        <w:rPr>
+          <w:rFonts w:cs="Segoe UI"/>
+          <w:color w:val="212529"/>
+        </w:rPr>
+        <w:t xml:space="preserve">Также изменился Heap </w:t>
+      </w:r>
       <w:proofErr w:type="spellStart"/>
       <w:r>
         <w:rPr>
           <w:rFonts w:cs="Segoe UI"/>
           <w:color w:val="212529"/>
         </w:rPr>
-        <w:t>ScriptFilter.getTranslatedScript</w:t>
+        <w:t>Dump</w:t>
       </w:r>
       <w:proofErr w:type="spellEnd"/>
       <w:r>
@@ -4715,22 +5307,24 @@
           <w:rFonts w:cs="Segoe UI"/>
           <w:color w:val="212529"/>
         </w:rPr>
-        <w:t>(...)</w:t>
-      </w:r>
-      <w:r>
-        <w:rPr>
-          <w:rFonts w:cs="Segoe UI"/>
-          <w:color w:val="212529"/>
-        </w:rPr>
-        <w:br/>
+        <w:t>. До исправления среди объектов </w:t>
       </w:r>
       <w:proofErr w:type="spellStart"/>
-      <w:r>
-        <w:rPr>
-          <w:rFonts w:cs="Segoe UI"/>
-          <w:color w:val="212529"/>
-        </w:rPr>
-        <w:t>Context.evaluateString</w:t>
+      <w:proofErr w:type="gramStart"/>
+      <w:r>
+        <w:rPr>
+          <w:rFonts w:cs="Segoe UI"/>
+          <w:color w:val="212529"/>
+        </w:rPr>
+        <w:t>java.lang</w:t>
+      </w:r>
+      <w:proofErr w:type="gramEnd"/>
+      <w:r>
+        <w:rPr>
+          <w:rFonts w:cs="Segoe UI"/>
+          <w:color w:val="212529"/>
+        </w:rPr>
+        <w:t>.String</w:t>
       </w:r>
       <w:proofErr w:type="spellEnd"/>
       <w:r>
@@ -4738,108 +5332,46 @@
           <w:rFonts w:cs="Segoe UI"/>
           <w:color w:val="212529"/>
         </w:rPr>
-        <w:t>(...)</w:t>
-      </w:r>
-    </w:p>
-    <w:p>
-      <w:pPr>
-        <w:shd w:val="clear" w:color="auto" w:fill="FFFFFF"/>
-        <w:spacing w:before="100" w:beforeAutospacing="1" w:after="100" w:afterAutospacing="1" w:line="240" w:lineRule="auto"/>
-        <w:rPr>
-          <w:rFonts w:cs="Segoe UI"/>
-          <w:color w:val="212529"/>
-        </w:rPr>
-      </w:pPr>
-      <w:r>
-        <w:rPr>
-          <w:rFonts w:cs="Segoe UI"/>
-          <w:color w:val="212529"/>
-        </w:rPr>
-        <w:t>После исправления основная работа программы сводится к стандартной обработке HTTP-ответ</w:t>
-      </w:r>
-      <w:r>
-        <w:rPr>
-          <w:rFonts w:cs="Segoe UI"/>
-          <w:color w:val="212529"/>
-        </w:rPr>
-        <w:t>а.</w:t>
-      </w:r>
-    </w:p>
-    <w:p>
-      <w:pPr>
-        <w:shd w:val="clear" w:color="auto" w:fill="FFFFFF"/>
-        <w:spacing w:before="100" w:beforeAutospacing="1" w:after="100" w:afterAutospacing="1" w:line="240" w:lineRule="auto"/>
-        <w:rPr>
-          <w:rFonts w:cs="Segoe UI"/>
-          <w:color w:val="212529"/>
-        </w:rPr>
-      </w:pPr>
-      <w:r>
-        <w:rPr>
-          <w:rFonts w:cs="Segoe UI"/>
-          <w:color w:val="212529"/>
-        </w:rPr>
-        <w:t xml:space="preserve">Также уменьшились аллокации памяти: </w:t>
-      </w:r>
-      <w:r>
+        <w:t> было видно большое количество одинаковых строк с сообщением:</w:t>
+      </w:r>
+    </w:p>
+    <w:p>
+      <w:pPr>
+        <w:shd w:val="clear" w:color="auto" w:fill="FFFFFF"/>
+        <w:spacing w:before="100" w:beforeAutospacing="1" w:after="100" w:afterAutospacing="1" w:line="240" w:lineRule="auto"/>
         <w:rPr>
           <w:rFonts w:cs="Segoe UI"/>
           <w:color w:val="212529"/>
           <w:lang w:val="en-US"/>
         </w:rPr>
-        <w:t>Main</w:t>
-      </w:r>
-      <w:r>
-        <w:rPr>
-          <w:rFonts w:cs="Segoe UI"/>
-          <w:color w:val="212529"/>
-        </w:rPr>
-        <w:t>.</w:t>
-      </w:r>
+      </w:pPr>
       <w:r>
         <w:rPr>
           <w:rFonts w:cs="Segoe UI"/>
           <w:color w:val="212529"/>
           <w:lang w:val="en-US"/>
         </w:rPr>
-        <w:t>main</w:t>
-      </w:r>
-      <w:r>
-        <w:rPr>
-          <w:rFonts w:cs="Segoe UI"/>
-          <w:color w:val="212529"/>
-        </w:rPr>
-        <w:t xml:space="preserve">() стал выделять около 165.8 </w:t>
-      </w:r>
+        <w:t>Script '</w:t>
+      </w:r>
+      <w:proofErr w:type="spellStart"/>
+      <w:proofErr w:type="gramStart"/>
       <w:r>
         <w:rPr>
           <w:rFonts w:cs="Segoe UI"/>
           <w:color w:val="212529"/>
           <w:lang w:val="en-US"/>
         </w:rPr>
-        <w:t>MB</w:t>
-      </w:r>
-      <w:r>
-        <w:rPr>
-          <w:rFonts w:cs="Segoe UI"/>
-          <w:color w:val="212529"/>
-        </w:rPr>
-        <w:t xml:space="preserve"> вместо 325.99 </w:t>
-      </w:r>
+        <w:t>document.wr</w:t>
+      </w:r>
+      <w:proofErr w:type="spellEnd"/>
+      <w:proofErr w:type="gramEnd"/>
       <w:r>
         <w:rPr>
           <w:rFonts w:cs="Segoe UI"/>
           <w:color w:val="212529"/>
           <w:lang w:val="en-US"/>
         </w:rPr>
-        <w:t>MB</w:t>
-      </w:r>
-      <w:r>
-        <w:rPr>
-          <w:rFonts w:cs="Segoe UI"/>
-          <w:color w:val="212529"/>
-        </w:rPr>
-        <w:t xml:space="preserve">, а </w:t>
+        <w:t xml:space="preserve">('Hello Document')//' failed: </w:t>
       </w:r>
       <w:proofErr w:type="spellStart"/>
       <w:r>
@@ -4848,24 +5380,50 @@
           <w:color w:val="212529"/>
           <w:lang w:val="en-US"/>
         </w:rPr>
-        <w:t>ServletUnitClient</w:t>
+        <w:t>TypeError</w:t>
       </w:r>
       <w:proofErr w:type="spellEnd"/>
       <w:r>
         <w:rPr>
           <w:rFonts w:cs="Segoe UI"/>
           <w:color w:val="212529"/>
-        </w:rPr>
-        <w:t>.</w:t>
+          <w:lang w:val="en-US"/>
+        </w:rPr>
+        <w:t xml:space="preserve"> ...</w:t>
+      </w:r>
+    </w:p>
+    <w:p>
+      <w:pPr>
+        <w:shd w:val="clear" w:color="auto" w:fill="FFFFFF"/>
+        <w:spacing w:before="100" w:beforeAutospacing="1" w:after="100" w:afterAutospacing="1" w:line="240" w:lineRule="auto"/>
+        <w:rPr>
+          <w:rFonts w:cs="Segoe UI"/>
+          <w:color w:val="212529"/>
+        </w:rPr>
+      </w:pPr>
+      <w:r>
+        <w:rPr>
+          <w:rFonts w:cs="Segoe UI"/>
+          <w:color w:val="212529"/>
+        </w:rPr>
+        <w:t>После исправления таких повторяющихся строк в начале списка </w:t>
       </w:r>
       <w:proofErr w:type="spellStart"/>
-      <w:r>
-        <w:rPr>
-          <w:rFonts w:cs="Segoe UI"/>
-          <w:color w:val="212529"/>
-          <w:lang w:val="en-US"/>
-        </w:rPr>
-        <w:t>getResponse</w:t>
+      <w:proofErr w:type="gramStart"/>
+      <w:r>
+        <w:rPr>
+          <w:rFonts w:cs="Segoe UI"/>
+          <w:color w:val="212529"/>
+        </w:rPr>
+        <w:t>java.lang</w:t>
+      </w:r>
+      <w:proofErr w:type="gramEnd"/>
+      <w:r>
+        <w:rPr>
+          <w:rFonts w:cs="Segoe UI"/>
+          <w:color w:val="212529"/>
+        </w:rPr>
+        <w:t>.String</w:t>
       </w:r>
       <w:proofErr w:type="spellEnd"/>
       <w:r>
@@ -4873,88 +5431,158 @@
           <w:rFonts w:cs="Segoe UI"/>
           <w:color w:val="212529"/>
         </w:rPr>
-        <w:t xml:space="preserve">(...) — около 145.6 </w:t>
-      </w:r>
-      <w:r>
-        <w:rPr>
-          <w:rFonts w:cs="Segoe UI"/>
-          <w:color w:val="212529"/>
-          <w:lang w:val="en-US"/>
-        </w:rPr>
-        <w:t>MB</w:t>
-      </w:r>
-      <w:r>
-        <w:rPr>
-          <w:rFonts w:cs="Segoe UI"/>
-          <w:color w:val="212529"/>
-        </w:rPr>
-        <w:t xml:space="preserve"> вместо 303.03 </w:t>
-      </w:r>
-      <w:r>
-        <w:rPr>
-          <w:rFonts w:cs="Segoe UI"/>
-          <w:color w:val="212529"/>
-          <w:lang w:val="en-US"/>
-        </w:rPr>
-        <w:t>MB</w:t>
-      </w:r>
-      <w:r>
-        <w:rPr>
-          <w:rFonts w:cs="Segoe UI"/>
-          <w:color w:val="212529"/>
-        </w:rPr>
-        <w:t>.</w:t>
-      </w:r>
-    </w:p>
-    <w:p>
-      <w:pPr>
-        <w:shd w:val="clear" w:color="auto" w:fill="FFFFFF"/>
-        <w:spacing w:before="100" w:beforeAutospacing="1" w:after="100" w:afterAutospacing="1" w:line="240" w:lineRule="auto"/>
-        <w:rPr>
-          <w:rFonts w:cs="Segoe UI"/>
-          <w:color w:val="212529"/>
-        </w:rPr>
-      </w:pPr>
-      <w:r>
-        <w:rPr>
-          <w:rFonts w:cs="Segoe UI"/>
-          <w:color w:val="212529"/>
-        </w:rPr>
-        <w:lastRenderedPageBreak/>
-        <w:t xml:space="preserve">Таким образом, причина была определена верно: проблему вызывала обработка JavaScript в HTML-ответе </w:t>
-      </w:r>
-      <w:proofErr w:type="spellStart"/>
-      <w:r>
-        <w:rPr>
-          <w:rFonts w:cs="Segoe UI"/>
-          <w:color w:val="212529"/>
-        </w:rPr>
-        <w:t>сервлета</w:t>
-      </w:r>
-      <w:proofErr w:type="spellEnd"/>
-      <w:r>
-        <w:rPr>
-          <w:rFonts w:cs="Segoe UI"/>
-          <w:color w:val="212529"/>
-        </w:rPr>
-        <w:t xml:space="preserve">. После удаления скрипта и отключения JavaScript в </w:t>
-      </w:r>
-      <w:proofErr w:type="spellStart"/>
-      <w:r>
-        <w:rPr>
-          <w:rFonts w:cs="Segoe UI"/>
-          <w:color w:val="212529"/>
-        </w:rPr>
-        <w:t>HttpUnit</w:t>
-      </w:r>
-      <w:proofErr w:type="spellEnd"/>
-      <w:r>
-        <w:rPr>
-          <w:rFonts w:cs="Segoe UI"/>
-          <w:color w:val="212529"/>
-        </w:rPr>
-        <w:t xml:space="preserve"> рост количества классов прекратился, а потребление ресурсов стало стабильнее.</w:t>
-      </w:r>
+        <w:t> больше нет. Вместо них отображаются обычные служебные строки JVM и VisualVM, связанные с GC и диагностикой. Это подтверждает, что сообщения JavaScript-ошибок больше не накапливаются в памяти в неограниченном количестве.</w:t>
+      </w:r>
+    </w:p>
+    <w:p>
+      <w:pPr>
+        <w:shd w:val="clear" w:color="auto" w:fill="FFFFFF"/>
+        <w:spacing w:before="100" w:beforeAutospacing="1" w:after="100" w:afterAutospacing="1" w:line="240" w:lineRule="auto"/>
+        <w:rPr>
+          <w:rFonts w:cs="Segoe UI"/>
+          <w:color w:val="212529"/>
+        </w:rPr>
+      </w:pPr>
+    </w:p>
+    <w:p>
+      <w:pPr>
+        <w:shd w:val="clear" w:color="auto" w:fill="FFFFFF"/>
+        <w:spacing w:before="100" w:beforeAutospacing="1" w:after="100" w:afterAutospacing="1" w:line="240" w:lineRule="auto"/>
+        <w:rPr>
+          <w:rFonts w:cs="Segoe UI"/>
+          <w:color w:val="212529"/>
+        </w:rPr>
+      </w:pPr>
+    </w:p>
+    <w:p>
+      <w:pPr>
+        <w:shd w:val="clear" w:color="auto" w:fill="FFFFFF"/>
+        <w:spacing w:before="100" w:beforeAutospacing="1" w:after="100" w:afterAutospacing="1" w:line="240" w:lineRule="auto"/>
+        <w:rPr>
+          <w:rFonts w:cs="Segoe UI"/>
+          <w:color w:val="212529"/>
+        </w:rPr>
+      </w:pPr>
+    </w:p>
+    <w:p>
+      <w:pPr>
+        <w:shd w:val="clear" w:color="auto" w:fill="FFFFFF"/>
+        <w:spacing w:before="100" w:beforeAutospacing="1" w:after="100" w:afterAutospacing="1" w:line="240" w:lineRule="auto"/>
+        <w:rPr>
+          <w:rFonts w:cs="Segoe UI"/>
+          <w:color w:val="212529"/>
+        </w:rPr>
+      </w:pPr>
+    </w:p>
+    <w:p>
+      <w:pPr>
+        <w:shd w:val="clear" w:color="auto" w:fill="FFFFFF"/>
+        <w:spacing w:before="100" w:beforeAutospacing="1" w:after="100" w:afterAutospacing="1" w:line="240" w:lineRule="auto"/>
+        <w:rPr>
+          <w:rFonts w:cs="Segoe UI"/>
+          <w:color w:val="212529"/>
+        </w:rPr>
+      </w:pPr>
+    </w:p>
+    <w:p>
+      <w:pPr>
+        <w:shd w:val="clear" w:color="auto" w:fill="FFFFFF"/>
+        <w:spacing w:before="100" w:beforeAutospacing="1" w:after="100" w:afterAutospacing="1" w:line="240" w:lineRule="auto"/>
+        <w:rPr>
+          <w:rFonts w:cs="Segoe UI"/>
+          <w:color w:val="212529"/>
+        </w:rPr>
+      </w:pPr>
+    </w:p>
+    <w:p>
+      <w:pPr>
+        <w:shd w:val="clear" w:color="auto" w:fill="FFFFFF"/>
+        <w:spacing w:before="100" w:beforeAutospacing="1" w:after="100" w:afterAutospacing="1" w:line="240" w:lineRule="auto"/>
+        <w:rPr>
+          <w:rFonts w:cs="Segoe UI"/>
+          <w:color w:val="212529"/>
+        </w:rPr>
+      </w:pPr>
+    </w:p>
+    <w:p>
+      <w:pPr>
+        <w:shd w:val="clear" w:color="auto" w:fill="FFFFFF"/>
+        <w:spacing w:before="100" w:beforeAutospacing="1" w:after="100" w:afterAutospacing="1" w:line="240" w:lineRule="auto"/>
+        <w:rPr>
+          <w:rFonts w:cs="Segoe UI"/>
+          <w:color w:val="212529"/>
+        </w:rPr>
+      </w:pPr>
+    </w:p>
+    <w:p>
+      <w:pPr>
+        <w:shd w:val="clear" w:color="auto" w:fill="FFFFFF"/>
+        <w:spacing w:before="100" w:beforeAutospacing="1" w:after="100" w:afterAutospacing="1" w:line="240" w:lineRule="auto"/>
+        <w:rPr>
+          <w:rFonts w:cs="Segoe UI"/>
+          <w:color w:val="212529"/>
+        </w:rPr>
+      </w:pPr>
+    </w:p>
+    <w:p>
+      <w:pPr>
+        <w:shd w:val="clear" w:color="auto" w:fill="FFFFFF"/>
+        <w:spacing w:before="100" w:beforeAutospacing="1" w:after="100" w:afterAutospacing="1" w:line="240" w:lineRule="auto"/>
+        <w:rPr>
+          <w:rFonts w:cs="Segoe UI"/>
+          <w:color w:val="212529"/>
+        </w:rPr>
+      </w:pPr>
+    </w:p>
+    <w:p>
+      <w:pPr>
+        <w:shd w:val="clear" w:color="auto" w:fill="FFFFFF"/>
+        <w:spacing w:before="100" w:beforeAutospacing="1" w:after="100" w:afterAutospacing="1" w:line="240" w:lineRule="auto"/>
+        <w:rPr>
+          <w:rFonts w:cs="Segoe UI"/>
+          <w:color w:val="212529"/>
+        </w:rPr>
+      </w:pPr>
+    </w:p>
+    <w:p>
+      <w:pPr>
+        <w:shd w:val="clear" w:color="auto" w:fill="FFFFFF"/>
+        <w:spacing w:before="100" w:beforeAutospacing="1" w:after="100" w:afterAutospacing="1" w:line="240" w:lineRule="auto"/>
+        <w:rPr>
+          <w:rFonts w:cs="Segoe UI"/>
+          <w:color w:val="212529"/>
+        </w:rPr>
+      </w:pPr>
+    </w:p>
+    <w:p>
+      <w:pPr>
+        <w:shd w:val="clear" w:color="auto" w:fill="FFFFFF"/>
+        <w:spacing w:before="100" w:beforeAutospacing="1" w:after="100" w:afterAutospacing="1" w:line="240" w:lineRule="auto"/>
+        <w:rPr>
+          <w:rFonts w:cs="Segoe UI"/>
+          <w:color w:val="212529"/>
+        </w:rPr>
+      </w:pPr>
+    </w:p>
+    <w:p>
+      <w:pPr>
+        <w:shd w:val="clear" w:color="auto" w:fill="FFFFFF"/>
+        <w:spacing w:before="100" w:beforeAutospacing="1" w:after="100" w:afterAutospacing="1" w:line="240" w:lineRule="auto"/>
+        <w:rPr>
+          <w:rFonts w:cs="Segoe UI"/>
+          <w:color w:val="212529"/>
+        </w:rPr>
+      </w:pPr>
+    </w:p>
+    <w:p>
+      <w:pPr>
+        <w:shd w:val="clear" w:color="auto" w:fill="FFFFFF"/>
+        <w:spacing w:before="100" w:beforeAutospacing="1" w:after="100" w:afterAutospacing="1" w:line="240" w:lineRule="auto"/>
+        <w:rPr>
+          <w:rFonts w:cs="Segoe UI"/>
+          <w:color w:val="212529"/>
+        </w:rPr>
+      </w:pPr>
     </w:p>
     <w:p>
       <w:pPr>
@@ -4970,7 +5598,7 @@
           <w14:ligatures w14:val="none"/>
         </w:rPr>
       </w:pPr>
-      <w:bookmarkStart w:id="4" w:name="_Toc229509439"/>
+      <w:bookmarkStart w:id="4" w:name="_Toc229595936"/>
       <w:r>
         <w:rPr>
           <w:rFonts w:asciiTheme="minorHAnsi" w:hAnsiTheme="minorHAnsi" w:cs="Times New Roman"/>
@@ -4978,6 +5606,7 @@
           <w:bCs/>
           <w:lang w:eastAsia="ru-RU"/>
         </w:rPr>
+        <w:lastRenderedPageBreak/>
         <w:t>Программа</w:t>
       </w:r>
       <w:bookmarkEnd w:id="4"/>
@@ -5057,7 +5686,7 @@
           <w:lang w:eastAsia="ru-RU"/>
         </w:rPr>
       </w:pPr>
-      <w:bookmarkStart w:id="5" w:name="_Toc229509440"/>
+      <w:bookmarkStart w:id="5" w:name="_Toc229595937"/>
       <w:r>
         <w:rPr>
           <w:rFonts w:asciiTheme="minorHAnsi" w:hAnsiTheme="minorHAnsi" w:cs="Times New Roman"/>

</xml_diff>